<commit_message>
Update transcript correlation results
</commit_message>
<xml_diff>
--- a/TranscriptAnalysis/results/correlation_conventional/-AKD2Lv7XqI/-AKD2Lv7XqI_correlation_topics_n0_p15_m6.docx
+++ b/TranscriptAnalysis/results/correlation_conventional/-AKD2Lv7XqI/-AKD2Lv7XqI_correlation_topics_n0_p15_m6.docx
@@ -127,7 +127,38 @@
           </w:tcPr>
           <w:p>
             <w:r>
-              <w:t>frame_0000.jpg</w:t>
+              <w:drawing>
+                <wp:inline xmlns:a="http://schemas.openxmlformats.org/drawingml/2006/main" xmlns:pic="http://schemas.openxmlformats.org/drawingml/2006/picture">
+                  <wp:extent cx="1097280" cy="617220"/>
+                  <wp:docPr id="1" name="Picture 1"/>
+                  <wp:cNvGraphicFramePr>
+                    <a:graphicFrameLocks noChangeAspect="1"/>
+                  </wp:cNvGraphicFramePr>
+                  <a:graphic>
+                    <a:graphicData uri="http://schemas.openxmlformats.org/drawingml/2006/picture">
+                      <pic:pic>
+                        <pic:nvPicPr>
+                          <pic:cNvPr id="0" name="frame_0000.jpg"/>
+                          <pic:cNvPicPr/>
+                        </pic:nvPicPr>
+                        <pic:blipFill>
+                          <a:blip r:embed="rId9"/>
+                          <a:stretch>
+                            <a:fillRect/>
+                          </a:stretch>
+                        </pic:blipFill>
+                        <pic:spPr>
+                          <a:xfrm>
+                            <a:off x="0" y="0"/>
+                            <a:ext cx="1097280" cy="617220"/>
+                          </a:xfrm>
+                          <a:prstGeom prst="rect"/>
+                        </pic:spPr>
+                      </pic:pic>
+                    </a:graphicData>
+                  </a:graphic>
+                </wp:inline>
+              </w:drawing>
             </w:r>
           </w:p>
         </w:tc>
@@ -137,7 +168,38 @@
           </w:tcPr>
           <w:p>
             <w:r>
-              <w:t>frame_0062.jpg</w:t>
+              <w:drawing>
+                <wp:inline xmlns:a="http://schemas.openxmlformats.org/drawingml/2006/main" xmlns:pic="http://schemas.openxmlformats.org/drawingml/2006/picture">
+                  <wp:extent cx="1097280" cy="617220"/>
+                  <wp:docPr id="2" name="Picture 2"/>
+                  <wp:cNvGraphicFramePr>
+                    <a:graphicFrameLocks noChangeAspect="1"/>
+                  </wp:cNvGraphicFramePr>
+                  <a:graphic>
+                    <a:graphicData uri="http://schemas.openxmlformats.org/drawingml/2006/picture">
+                      <pic:pic>
+                        <pic:nvPicPr>
+                          <pic:cNvPr id="0" name="frame_0062.jpg"/>
+                          <pic:cNvPicPr/>
+                        </pic:nvPicPr>
+                        <pic:blipFill>
+                          <a:blip r:embed="rId10"/>
+                          <a:stretch>
+                            <a:fillRect/>
+                          </a:stretch>
+                        </pic:blipFill>
+                        <pic:spPr>
+                          <a:xfrm>
+                            <a:off x="0" y="0"/>
+                            <a:ext cx="1097280" cy="617220"/>
+                          </a:xfrm>
+                          <a:prstGeom prst="rect"/>
+                        </pic:spPr>
+                      </pic:pic>
+                    </a:graphicData>
+                  </a:graphic>
+                </wp:inline>
+              </w:drawing>
             </w:r>
           </w:p>
         </w:tc>
@@ -147,7 +209,38 @@
           </w:tcPr>
           <w:p>
             <w:r>
-              <w:t>frame_0124.jpg</w:t>
+              <w:drawing>
+                <wp:inline xmlns:a="http://schemas.openxmlformats.org/drawingml/2006/main" xmlns:pic="http://schemas.openxmlformats.org/drawingml/2006/picture">
+                  <wp:extent cx="1097280" cy="617220"/>
+                  <wp:docPr id="3" name="Picture 3"/>
+                  <wp:cNvGraphicFramePr>
+                    <a:graphicFrameLocks noChangeAspect="1"/>
+                  </wp:cNvGraphicFramePr>
+                  <a:graphic>
+                    <a:graphicData uri="http://schemas.openxmlformats.org/drawingml/2006/picture">
+                      <pic:pic>
+                        <pic:nvPicPr>
+                          <pic:cNvPr id="0" name="frame_0124.jpg"/>
+                          <pic:cNvPicPr/>
+                        </pic:nvPicPr>
+                        <pic:blipFill>
+                          <a:blip r:embed="rId11"/>
+                          <a:stretch>
+                            <a:fillRect/>
+                          </a:stretch>
+                        </pic:blipFill>
+                        <pic:spPr>
+                          <a:xfrm>
+                            <a:off x="0" y="0"/>
+                            <a:ext cx="1097280" cy="617220"/>
+                          </a:xfrm>
+                          <a:prstGeom prst="rect"/>
+                        </pic:spPr>
+                      </pic:pic>
+                    </a:graphicData>
+                  </a:graphic>
+                </wp:inline>
+              </w:drawing>
             </w:r>
           </w:p>
         </w:tc>
@@ -186,7 +279,38 @@
           </w:tcPr>
           <w:p>
             <w:r>
-              <w:t>frame_0000.jpg</w:t>
+              <w:drawing>
+                <wp:inline xmlns:a="http://schemas.openxmlformats.org/drawingml/2006/main" xmlns:pic="http://schemas.openxmlformats.org/drawingml/2006/picture">
+                  <wp:extent cx="1097280" cy="617220"/>
+                  <wp:docPr id="4" name="Picture 4"/>
+                  <wp:cNvGraphicFramePr>
+                    <a:graphicFrameLocks noChangeAspect="1"/>
+                  </wp:cNvGraphicFramePr>
+                  <a:graphic>
+                    <a:graphicData uri="http://schemas.openxmlformats.org/drawingml/2006/picture">
+                      <pic:pic>
+                        <pic:nvPicPr>
+                          <pic:cNvPr id="0" name="frame_0000.jpg"/>
+                          <pic:cNvPicPr/>
+                        </pic:nvPicPr>
+                        <pic:blipFill>
+                          <a:blip r:embed="rId9"/>
+                          <a:stretch>
+                            <a:fillRect/>
+                          </a:stretch>
+                        </pic:blipFill>
+                        <pic:spPr>
+                          <a:xfrm>
+                            <a:off x="0" y="0"/>
+                            <a:ext cx="1097280" cy="617220"/>
+                          </a:xfrm>
+                          <a:prstGeom prst="rect"/>
+                        </pic:spPr>
+                      </pic:pic>
+                    </a:graphicData>
+                  </a:graphic>
+                </wp:inline>
+              </w:drawing>
             </w:r>
           </w:p>
         </w:tc>
@@ -196,7 +320,38 @@
           </w:tcPr>
           <w:p>
             <w:r>
-              <w:t>frame_0062.jpg</w:t>
+              <w:drawing>
+                <wp:inline xmlns:a="http://schemas.openxmlformats.org/drawingml/2006/main" xmlns:pic="http://schemas.openxmlformats.org/drawingml/2006/picture">
+                  <wp:extent cx="1097280" cy="617220"/>
+                  <wp:docPr id="5" name="Picture 5"/>
+                  <wp:cNvGraphicFramePr>
+                    <a:graphicFrameLocks noChangeAspect="1"/>
+                  </wp:cNvGraphicFramePr>
+                  <a:graphic>
+                    <a:graphicData uri="http://schemas.openxmlformats.org/drawingml/2006/picture">
+                      <pic:pic>
+                        <pic:nvPicPr>
+                          <pic:cNvPr id="0" name="frame_0062.jpg"/>
+                          <pic:cNvPicPr/>
+                        </pic:nvPicPr>
+                        <pic:blipFill>
+                          <a:blip r:embed="rId10"/>
+                          <a:stretch>
+                            <a:fillRect/>
+                          </a:stretch>
+                        </pic:blipFill>
+                        <pic:spPr>
+                          <a:xfrm>
+                            <a:off x="0" y="0"/>
+                            <a:ext cx="1097280" cy="617220"/>
+                          </a:xfrm>
+                          <a:prstGeom prst="rect"/>
+                        </pic:spPr>
+                      </pic:pic>
+                    </a:graphicData>
+                  </a:graphic>
+                </wp:inline>
+              </w:drawing>
             </w:r>
           </w:p>
         </w:tc>
@@ -206,7 +361,38 @@
           </w:tcPr>
           <w:p>
             <w:r>
-              <w:t>frame_0124.jpg</w:t>
+              <w:drawing>
+                <wp:inline xmlns:a="http://schemas.openxmlformats.org/drawingml/2006/main" xmlns:pic="http://schemas.openxmlformats.org/drawingml/2006/picture">
+                  <wp:extent cx="1097280" cy="617220"/>
+                  <wp:docPr id="6" name="Picture 6"/>
+                  <wp:cNvGraphicFramePr>
+                    <a:graphicFrameLocks noChangeAspect="1"/>
+                  </wp:cNvGraphicFramePr>
+                  <a:graphic>
+                    <a:graphicData uri="http://schemas.openxmlformats.org/drawingml/2006/picture">
+                      <pic:pic>
+                        <pic:nvPicPr>
+                          <pic:cNvPr id="0" name="frame_0124.jpg"/>
+                          <pic:cNvPicPr/>
+                        </pic:nvPicPr>
+                        <pic:blipFill>
+                          <a:blip r:embed="rId11"/>
+                          <a:stretch>
+                            <a:fillRect/>
+                          </a:stretch>
+                        </pic:blipFill>
+                        <pic:spPr>
+                          <a:xfrm>
+                            <a:off x="0" y="0"/>
+                            <a:ext cx="1097280" cy="617220"/>
+                          </a:xfrm>
+                          <a:prstGeom prst="rect"/>
+                        </pic:spPr>
+                      </pic:pic>
+                    </a:graphicData>
+                  </a:graphic>
+                </wp:inline>
+              </w:drawing>
             </w:r>
           </w:p>
         </w:tc>
@@ -245,7 +431,38 @@
           </w:tcPr>
           <w:p>
             <w:r>
-              <w:t>frame_0000.jpg</w:t>
+              <w:drawing>
+                <wp:inline xmlns:a="http://schemas.openxmlformats.org/drawingml/2006/main" xmlns:pic="http://schemas.openxmlformats.org/drawingml/2006/picture">
+                  <wp:extent cx="1097280" cy="617220"/>
+                  <wp:docPr id="7" name="Picture 7"/>
+                  <wp:cNvGraphicFramePr>
+                    <a:graphicFrameLocks noChangeAspect="1"/>
+                  </wp:cNvGraphicFramePr>
+                  <a:graphic>
+                    <a:graphicData uri="http://schemas.openxmlformats.org/drawingml/2006/picture">
+                      <pic:pic>
+                        <pic:nvPicPr>
+                          <pic:cNvPr id="0" name="frame_0000.jpg"/>
+                          <pic:cNvPicPr/>
+                        </pic:nvPicPr>
+                        <pic:blipFill>
+                          <a:blip r:embed="rId9"/>
+                          <a:stretch>
+                            <a:fillRect/>
+                          </a:stretch>
+                        </pic:blipFill>
+                        <pic:spPr>
+                          <a:xfrm>
+                            <a:off x="0" y="0"/>
+                            <a:ext cx="1097280" cy="617220"/>
+                          </a:xfrm>
+                          <a:prstGeom prst="rect"/>
+                        </pic:spPr>
+                      </pic:pic>
+                    </a:graphicData>
+                  </a:graphic>
+                </wp:inline>
+              </w:drawing>
             </w:r>
           </w:p>
         </w:tc>
@@ -255,7 +472,38 @@
           </w:tcPr>
           <w:p>
             <w:r>
-              <w:t>frame_0062.jpg</w:t>
+              <w:drawing>
+                <wp:inline xmlns:a="http://schemas.openxmlformats.org/drawingml/2006/main" xmlns:pic="http://schemas.openxmlformats.org/drawingml/2006/picture">
+                  <wp:extent cx="1097280" cy="617220"/>
+                  <wp:docPr id="8" name="Picture 8"/>
+                  <wp:cNvGraphicFramePr>
+                    <a:graphicFrameLocks noChangeAspect="1"/>
+                  </wp:cNvGraphicFramePr>
+                  <a:graphic>
+                    <a:graphicData uri="http://schemas.openxmlformats.org/drawingml/2006/picture">
+                      <pic:pic>
+                        <pic:nvPicPr>
+                          <pic:cNvPr id="0" name="frame_0062.jpg"/>
+                          <pic:cNvPicPr/>
+                        </pic:nvPicPr>
+                        <pic:blipFill>
+                          <a:blip r:embed="rId10"/>
+                          <a:stretch>
+                            <a:fillRect/>
+                          </a:stretch>
+                        </pic:blipFill>
+                        <pic:spPr>
+                          <a:xfrm>
+                            <a:off x="0" y="0"/>
+                            <a:ext cx="1097280" cy="617220"/>
+                          </a:xfrm>
+                          <a:prstGeom prst="rect"/>
+                        </pic:spPr>
+                      </pic:pic>
+                    </a:graphicData>
+                  </a:graphic>
+                </wp:inline>
+              </w:drawing>
             </w:r>
           </w:p>
         </w:tc>
@@ -265,7 +513,38 @@
           </w:tcPr>
           <w:p>
             <w:r>
-              <w:t>frame_0124.jpg</w:t>
+              <w:drawing>
+                <wp:inline xmlns:a="http://schemas.openxmlformats.org/drawingml/2006/main" xmlns:pic="http://schemas.openxmlformats.org/drawingml/2006/picture">
+                  <wp:extent cx="1097280" cy="617220"/>
+                  <wp:docPr id="9" name="Picture 9"/>
+                  <wp:cNvGraphicFramePr>
+                    <a:graphicFrameLocks noChangeAspect="1"/>
+                  </wp:cNvGraphicFramePr>
+                  <a:graphic>
+                    <a:graphicData uri="http://schemas.openxmlformats.org/drawingml/2006/picture">
+                      <pic:pic>
+                        <pic:nvPicPr>
+                          <pic:cNvPr id="0" name="frame_0124.jpg"/>
+                          <pic:cNvPicPr/>
+                        </pic:nvPicPr>
+                        <pic:blipFill>
+                          <a:blip r:embed="rId11"/>
+                          <a:stretch>
+                            <a:fillRect/>
+                          </a:stretch>
+                        </pic:blipFill>
+                        <pic:spPr>
+                          <a:xfrm>
+                            <a:off x="0" y="0"/>
+                            <a:ext cx="1097280" cy="617220"/>
+                          </a:xfrm>
+                          <a:prstGeom prst="rect"/>
+                        </pic:spPr>
+                      </pic:pic>
+                    </a:graphicData>
+                  </a:graphic>
+                </wp:inline>
+              </w:drawing>
             </w:r>
           </w:p>
         </w:tc>
@@ -304,7 +583,38 @@
           </w:tcPr>
           <w:p>
             <w:r>
-              <w:t>frame_0000.jpg</w:t>
+              <w:drawing>
+                <wp:inline xmlns:a="http://schemas.openxmlformats.org/drawingml/2006/main" xmlns:pic="http://schemas.openxmlformats.org/drawingml/2006/picture">
+                  <wp:extent cx="1097280" cy="617220"/>
+                  <wp:docPr id="10" name="Picture 10"/>
+                  <wp:cNvGraphicFramePr>
+                    <a:graphicFrameLocks noChangeAspect="1"/>
+                  </wp:cNvGraphicFramePr>
+                  <a:graphic>
+                    <a:graphicData uri="http://schemas.openxmlformats.org/drawingml/2006/picture">
+                      <pic:pic>
+                        <pic:nvPicPr>
+                          <pic:cNvPr id="0" name="frame_0000.jpg"/>
+                          <pic:cNvPicPr/>
+                        </pic:nvPicPr>
+                        <pic:blipFill>
+                          <a:blip r:embed="rId9"/>
+                          <a:stretch>
+                            <a:fillRect/>
+                          </a:stretch>
+                        </pic:blipFill>
+                        <pic:spPr>
+                          <a:xfrm>
+                            <a:off x="0" y="0"/>
+                            <a:ext cx="1097280" cy="617220"/>
+                          </a:xfrm>
+                          <a:prstGeom prst="rect"/>
+                        </pic:spPr>
+                      </pic:pic>
+                    </a:graphicData>
+                  </a:graphic>
+                </wp:inline>
+              </w:drawing>
             </w:r>
           </w:p>
         </w:tc>
@@ -314,7 +624,38 @@
           </w:tcPr>
           <w:p>
             <w:r>
-              <w:t>frame_0062.jpg</w:t>
+              <w:drawing>
+                <wp:inline xmlns:a="http://schemas.openxmlformats.org/drawingml/2006/main" xmlns:pic="http://schemas.openxmlformats.org/drawingml/2006/picture">
+                  <wp:extent cx="1097280" cy="617220"/>
+                  <wp:docPr id="11" name="Picture 11"/>
+                  <wp:cNvGraphicFramePr>
+                    <a:graphicFrameLocks noChangeAspect="1"/>
+                  </wp:cNvGraphicFramePr>
+                  <a:graphic>
+                    <a:graphicData uri="http://schemas.openxmlformats.org/drawingml/2006/picture">
+                      <pic:pic>
+                        <pic:nvPicPr>
+                          <pic:cNvPr id="0" name="frame_0062.jpg"/>
+                          <pic:cNvPicPr/>
+                        </pic:nvPicPr>
+                        <pic:blipFill>
+                          <a:blip r:embed="rId10"/>
+                          <a:stretch>
+                            <a:fillRect/>
+                          </a:stretch>
+                        </pic:blipFill>
+                        <pic:spPr>
+                          <a:xfrm>
+                            <a:off x="0" y="0"/>
+                            <a:ext cx="1097280" cy="617220"/>
+                          </a:xfrm>
+                          <a:prstGeom prst="rect"/>
+                        </pic:spPr>
+                      </pic:pic>
+                    </a:graphicData>
+                  </a:graphic>
+                </wp:inline>
+              </w:drawing>
             </w:r>
           </w:p>
         </w:tc>
@@ -324,7 +665,38 @@
           </w:tcPr>
           <w:p>
             <w:r>
-              <w:t>frame_0124.jpg</w:t>
+              <w:drawing>
+                <wp:inline xmlns:a="http://schemas.openxmlformats.org/drawingml/2006/main" xmlns:pic="http://schemas.openxmlformats.org/drawingml/2006/picture">
+                  <wp:extent cx="1097280" cy="617220"/>
+                  <wp:docPr id="12" name="Picture 12"/>
+                  <wp:cNvGraphicFramePr>
+                    <a:graphicFrameLocks noChangeAspect="1"/>
+                  </wp:cNvGraphicFramePr>
+                  <a:graphic>
+                    <a:graphicData uri="http://schemas.openxmlformats.org/drawingml/2006/picture">
+                      <pic:pic>
+                        <pic:nvPicPr>
+                          <pic:cNvPr id="0" name="frame_0124.jpg"/>
+                          <pic:cNvPicPr/>
+                        </pic:nvPicPr>
+                        <pic:blipFill>
+                          <a:blip r:embed="rId11"/>
+                          <a:stretch>
+                            <a:fillRect/>
+                          </a:stretch>
+                        </pic:blipFill>
+                        <pic:spPr>
+                          <a:xfrm>
+                            <a:off x="0" y="0"/>
+                            <a:ext cx="1097280" cy="617220"/>
+                          </a:xfrm>
+                          <a:prstGeom prst="rect"/>
+                        </pic:spPr>
+                      </pic:pic>
+                    </a:graphicData>
+                  </a:graphic>
+                </wp:inline>
+              </w:drawing>
             </w:r>
           </w:p>
         </w:tc>
@@ -368,7 +740,38 @@
           </w:tcPr>
           <w:p>
             <w:r>
-              <w:t>frame_0000.jpg</w:t>
+              <w:drawing>
+                <wp:inline xmlns:a="http://schemas.openxmlformats.org/drawingml/2006/main" xmlns:pic="http://schemas.openxmlformats.org/drawingml/2006/picture">
+                  <wp:extent cx="1097280" cy="617220"/>
+                  <wp:docPr id="13" name="Picture 13"/>
+                  <wp:cNvGraphicFramePr>
+                    <a:graphicFrameLocks noChangeAspect="1"/>
+                  </wp:cNvGraphicFramePr>
+                  <a:graphic>
+                    <a:graphicData uri="http://schemas.openxmlformats.org/drawingml/2006/picture">
+                      <pic:pic>
+                        <pic:nvPicPr>
+                          <pic:cNvPr id="0" name="frame_0000.jpg"/>
+                          <pic:cNvPicPr/>
+                        </pic:nvPicPr>
+                        <pic:blipFill>
+                          <a:blip r:embed="rId9"/>
+                          <a:stretch>
+                            <a:fillRect/>
+                          </a:stretch>
+                        </pic:blipFill>
+                        <pic:spPr>
+                          <a:xfrm>
+                            <a:off x="0" y="0"/>
+                            <a:ext cx="1097280" cy="617220"/>
+                          </a:xfrm>
+                          <a:prstGeom prst="rect"/>
+                        </pic:spPr>
+                      </pic:pic>
+                    </a:graphicData>
+                  </a:graphic>
+                </wp:inline>
+              </w:drawing>
             </w:r>
           </w:p>
         </w:tc>
@@ -378,7 +781,38 @@
           </w:tcPr>
           <w:p>
             <w:r>
-              <w:t>frame_0062.jpg</w:t>
+              <w:drawing>
+                <wp:inline xmlns:a="http://schemas.openxmlformats.org/drawingml/2006/main" xmlns:pic="http://schemas.openxmlformats.org/drawingml/2006/picture">
+                  <wp:extent cx="1097280" cy="617220"/>
+                  <wp:docPr id="14" name="Picture 14"/>
+                  <wp:cNvGraphicFramePr>
+                    <a:graphicFrameLocks noChangeAspect="1"/>
+                  </wp:cNvGraphicFramePr>
+                  <a:graphic>
+                    <a:graphicData uri="http://schemas.openxmlformats.org/drawingml/2006/picture">
+                      <pic:pic>
+                        <pic:nvPicPr>
+                          <pic:cNvPr id="0" name="frame_0062.jpg"/>
+                          <pic:cNvPicPr/>
+                        </pic:nvPicPr>
+                        <pic:blipFill>
+                          <a:blip r:embed="rId10"/>
+                          <a:stretch>
+                            <a:fillRect/>
+                          </a:stretch>
+                        </pic:blipFill>
+                        <pic:spPr>
+                          <a:xfrm>
+                            <a:off x="0" y="0"/>
+                            <a:ext cx="1097280" cy="617220"/>
+                          </a:xfrm>
+                          <a:prstGeom prst="rect"/>
+                        </pic:spPr>
+                      </pic:pic>
+                    </a:graphicData>
+                  </a:graphic>
+                </wp:inline>
+              </w:drawing>
             </w:r>
           </w:p>
         </w:tc>
@@ -388,7 +822,38 @@
           </w:tcPr>
           <w:p>
             <w:r>
-              <w:t>frame_0124.jpg</w:t>
+              <w:drawing>
+                <wp:inline xmlns:a="http://schemas.openxmlformats.org/drawingml/2006/main" xmlns:pic="http://schemas.openxmlformats.org/drawingml/2006/picture">
+                  <wp:extent cx="1097280" cy="617220"/>
+                  <wp:docPr id="15" name="Picture 15"/>
+                  <wp:cNvGraphicFramePr>
+                    <a:graphicFrameLocks noChangeAspect="1"/>
+                  </wp:cNvGraphicFramePr>
+                  <a:graphic>
+                    <a:graphicData uri="http://schemas.openxmlformats.org/drawingml/2006/picture">
+                      <pic:pic>
+                        <pic:nvPicPr>
+                          <pic:cNvPr id="0" name="frame_0124.jpg"/>
+                          <pic:cNvPicPr/>
+                        </pic:nvPicPr>
+                        <pic:blipFill>
+                          <a:blip r:embed="rId11"/>
+                          <a:stretch>
+                            <a:fillRect/>
+                          </a:stretch>
+                        </pic:blipFill>
+                        <pic:spPr>
+                          <a:xfrm>
+                            <a:off x="0" y="0"/>
+                            <a:ext cx="1097280" cy="617220"/>
+                          </a:xfrm>
+                          <a:prstGeom prst="rect"/>
+                        </pic:spPr>
+                      </pic:pic>
+                    </a:graphicData>
+                  </a:graphic>
+                </wp:inline>
+              </w:drawing>
             </w:r>
           </w:p>
         </w:tc>
@@ -427,7 +892,38 @@
           </w:tcPr>
           <w:p>
             <w:r>
-              <w:t>frame_0000.jpg</w:t>
+              <w:drawing>
+                <wp:inline xmlns:a="http://schemas.openxmlformats.org/drawingml/2006/main" xmlns:pic="http://schemas.openxmlformats.org/drawingml/2006/picture">
+                  <wp:extent cx="1097280" cy="617220"/>
+                  <wp:docPr id="16" name="Picture 16"/>
+                  <wp:cNvGraphicFramePr>
+                    <a:graphicFrameLocks noChangeAspect="1"/>
+                  </wp:cNvGraphicFramePr>
+                  <a:graphic>
+                    <a:graphicData uri="http://schemas.openxmlformats.org/drawingml/2006/picture">
+                      <pic:pic>
+                        <pic:nvPicPr>
+                          <pic:cNvPr id="0" name="frame_0000.jpg"/>
+                          <pic:cNvPicPr/>
+                        </pic:nvPicPr>
+                        <pic:blipFill>
+                          <a:blip r:embed="rId9"/>
+                          <a:stretch>
+                            <a:fillRect/>
+                          </a:stretch>
+                        </pic:blipFill>
+                        <pic:spPr>
+                          <a:xfrm>
+                            <a:off x="0" y="0"/>
+                            <a:ext cx="1097280" cy="617220"/>
+                          </a:xfrm>
+                          <a:prstGeom prst="rect"/>
+                        </pic:spPr>
+                      </pic:pic>
+                    </a:graphicData>
+                  </a:graphic>
+                </wp:inline>
+              </w:drawing>
             </w:r>
           </w:p>
         </w:tc>
@@ -437,7 +933,38 @@
           </w:tcPr>
           <w:p>
             <w:r>
-              <w:t>frame_0062.jpg</w:t>
+              <w:drawing>
+                <wp:inline xmlns:a="http://schemas.openxmlformats.org/drawingml/2006/main" xmlns:pic="http://schemas.openxmlformats.org/drawingml/2006/picture">
+                  <wp:extent cx="1097280" cy="617220"/>
+                  <wp:docPr id="17" name="Picture 17"/>
+                  <wp:cNvGraphicFramePr>
+                    <a:graphicFrameLocks noChangeAspect="1"/>
+                  </wp:cNvGraphicFramePr>
+                  <a:graphic>
+                    <a:graphicData uri="http://schemas.openxmlformats.org/drawingml/2006/picture">
+                      <pic:pic>
+                        <pic:nvPicPr>
+                          <pic:cNvPr id="0" name="frame_0062.jpg"/>
+                          <pic:cNvPicPr/>
+                        </pic:nvPicPr>
+                        <pic:blipFill>
+                          <a:blip r:embed="rId10"/>
+                          <a:stretch>
+                            <a:fillRect/>
+                          </a:stretch>
+                        </pic:blipFill>
+                        <pic:spPr>
+                          <a:xfrm>
+                            <a:off x="0" y="0"/>
+                            <a:ext cx="1097280" cy="617220"/>
+                          </a:xfrm>
+                          <a:prstGeom prst="rect"/>
+                        </pic:spPr>
+                      </pic:pic>
+                    </a:graphicData>
+                  </a:graphic>
+                </wp:inline>
+              </w:drawing>
             </w:r>
           </w:p>
         </w:tc>
@@ -447,7 +974,38 @@
           </w:tcPr>
           <w:p>
             <w:r>
-              <w:t>frame_0124.jpg</w:t>
+              <w:drawing>
+                <wp:inline xmlns:a="http://schemas.openxmlformats.org/drawingml/2006/main" xmlns:pic="http://schemas.openxmlformats.org/drawingml/2006/picture">
+                  <wp:extent cx="1097280" cy="617220"/>
+                  <wp:docPr id="18" name="Picture 18"/>
+                  <wp:cNvGraphicFramePr>
+                    <a:graphicFrameLocks noChangeAspect="1"/>
+                  </wp:cNvGraphicFramePr>
+                  <a:graphic>
+                    <a:graphicData uri="http://schemas.openxmlformats.org/drawingml/2006/picture">
+                      <pic:pic>
+                        <pic:nvPicPr>
+                          <pic:cNvPr id="0" name="frame_0124.jpg"/>
+                          <pic:cNvPicPr/>
+                        </pic:nvPicPr>
+                        <pic:blipFill>
+                          <a:blip r:embed="rId11"/>
+                          <a:stretch>
+                            <a:fillRect/>
+                          </a:stretch>
+                        </pic:blipFill>
+                        <pic:spPr>
+                          <a:xfrm>
+                            <a:off x="0" y="0"/>
+                            <a:ext cx="1097280" cy="617220"/>
+                          </a:xfrm>
+                          <a:prstGeom prst="rect"/>
+                        </pic:spPr>
+                      </pic:pic>
+                    </a:graphicData>
+                  </a:graphic>
+                </wp:inline>
+              </w:drawing>
             </w:r>
           </w:p>
         </w:tc>
@@ -486,7 +1044,38 @@
           </w:tcPr>
           <w:p>
             <w:r>
-              <w:t>frame_0000.jpg</w:t>
+              <w:drawing>
+                <wp:inline xmlns:a="http://schemas.openxmlformats.org/drawingml/2006/main" xmlns:pic="http://schemas.openxmlformats.org/drawingml/2006/picture">
+                  <wp:extent cx="1097280" cy="617220"/>
+                  <wp:docPr id="19" name="Picture 19"/>
+                  <wp:cNvGraphicFramePr>
+                    <a:graphicFrameLocks noChangeAspect="1"/>
+                  </wp:cNvGraphicFramePr>
+                  <a:graphic>
+                    <a:graphicData uri="http://schemas.openxmlformats.org/drawingml/2006/picture">
+                      <pic:pic>
+                        <pic:nvPicPr>
+                          <pic:cNvPr id="0" name="frame_0000.jpg"/>
+                          <pic:cNvPicPr/>
+                        </pic:nvPicPr>
+                        <pic:blipFill>
+                          <a:blip r:embed="rId9"/>
+                          <a:stretch>
+                            <a:fillRect/>
+                          </a:stretch>
+                        </pic:blipFill>
+                        <pic:spPr>
+                          <a:xfrm>
+                            <a:off x="0" y="0"/>
+                            <a:ext cx="1097280" cy="617220"/>
+                          </a:xfrm>
+                          <a:prstGeom prst="rect"/>
+                        </pic:spPr>
+                      </pic:pic>
+                    </a:graphicData>
+                  </a:graphic>
+                </wp:inline>
+              </w:drawing>
             </w:r>
           </w:p>
         </w:tc>
@@ -496,7 +1085,38 @@
           </w:tcPr>
           <w:p>
             <w:r>
-              <w:t>frame_0062.jpg</w:t>
+              <w:drawing>
+                <wp:inline xmlns:a="http://schemas.openxmlformats.org/drawingml/2006/main" xmlns:pic="http://schemas.openxmlformats.org/drawingml/2006/picture">
+                  <wp:extent cx="1097280" cy="617220"/>
+                  <wp:docPr id="20" name="Picture 20"/>
+                  <wp:cNvGraphicFramePr>
+                    <a:graphicFrameLocks noChangeAspect="1"/>
+                  </wp:cNvGraphicFramePr>
+                  <a:graphic>
+                    <a:graphicData uri="http://schemas.openxmlformats.org/drawingml/2006/picture">
+                      <pic:pic>
+                        <pic:nvPicPr>
+                          <pic:cNvPr id="0" name="frame_0062.jpg"/>
+                          <pic:cNvPicPr/>
+                        </pic:nvPicPr>
+                        <pic:blipFill>
+                          <a:blip r:embed="rId10"/>
+                          <a:stretch>
+                            <a:fillRect/>
+                          </a:stretch>
+                        </pic:blipFill>
+                        <pic:spPr>
+                          <a:xfrm>
+                            <a:off x="0" y="0"/>
+                            <a:ext cx="1097280" cy="617220"/>
+                          </a:xfrm>
+                          <a:prstGeom prst="rect"/>
+                        </pic:spPr>
+                      </pic:pic>
+                    </a:graphicData>
+                  </a:graphic>
+                </wp:inline>
+              </w:drawing>
             </w:r>
           </w:p>
         </w:tc>
@@ -506,7 +1126,38 @@
           </w:tcPr>
           <w:p>
             <w:r>
-              <w:t>frame_0124.jpg</w:t>
+              <w:drawing>
+                <wp:inline xmlns:a="http://schemas.openxmlformats.org/drawingml/2006/main" xmlns:pic="http://schemas.openxmlformats.org/drawingml/2006/picture">
+                  <wp:extent cx="1097280" cy="617220"/>
+                  <wp:docPr id="21" name="Picture 21"/>
+                  <wp:cNvGraphicFramePr>
+                    <a:graphicFrameLocks noChangeAspect="1"/>
+                  </wp:cNvGraphicFramePr>
+                  <a:graphic>
+                    <a:graphicData uri="http://schemas.openxmlformats.org/drawingml/2006/picture">
+                      <pic:pic>
+                        <pic:nvPicPr>
+                          <pic:cNvPr id="0" name="frame_0124.jpg"/>
+                          <pic:cNvPicPr/>
+                        </pic:nvPicPr>
+                        <pic:blipFill>
+                          <a:blip r:embed="rId11"/>
+                          <a:stretch>
+                            <a:fillRect/>
+                          </a:stretch>
+                        </pic:blipFill>
+                        <pic:spPr>
+                          <a:xfrm>
+                            <a:off x="0" y="0"/>
+                            <a:ext cx="1097280" cy="617220"/>
+                          </a:xfrm>
+                          <a:prstGeom prst="rect"/>
+                        </pic:spPr>
+                      </pic:pic>
+                    </a:graphicData>
+                  </a:graphic>
+                </wp:inline>
+              </w:drawing>
             </w:r>
           </w:p>
         </w:tc>
@@ -545,7 +1196,38 @@
           </w:tcPr>
           <w:p>
             <w:r>
-              <w:t>frame_0000.jpg</w:t>
+              <w:drawing>
+                <wp:inline xmlns:a="http://schemas.openxmlformats.org/drawingml/2006/main" xmlns:pic="http://schemas.openxmlformats.org/drawingml/2006/picture">
+                  <wp:extent cx="1097280" cy="617220"/>
+                  <wp:docPr id="22" name="Picture 22"/>
+                  <wp:cNvGraphicFramePr>
+                    <a:graphicFrameLocks noChangeAspect="1"/>
+                  </wp:cNvGraphicFramePr>
+                  <a:graphic>
+                    <a:graphicData uri="http://schemas.openxmlformats.org/drawingml/2006/picture">
+                      <pic:pic>
+                        <pic:nvPicPr>
+                          <pic:cNvPr id="0" name="frame_0000.jpg"/>
+                          <pic:cNvPicPr/>
+                        </pic:nvPicPr>
+                        <pic:blipFill>
+                          <a:blip r:embed="rId9"/>
+                          <a:stretch>
+                            <a:fillRect/>
+                          </a:stretch>
+                        </pic:blipFill>
+                        <pic:spPr>
+                          <a:xfrm>
+                            <a:off x="0" y="0"/>
+                            <a:ext cx="1097280" cy="617220"/>
+                          </a:xfrm>
+                          <a:prstGeom prst="rect"/>
+                        </pic:spPr>
+                      </pic:pic>
+                    </a:graphicData>
+                  </a:graphic>
+                </wp:inline>
+              </w:drawing>
             </w:r>
           </w:p>
         </w:tc>
@@ -555,7 +1237,38 @@
           </w:tcPr>
           <w:p>
             <w:r>
-              <w:t>frame_0062.jpg</w:t>
+              <w:drawing>
+                <wp:inline xmlns:a="http://schemas.openxmlformats.org/drawingml/2006/main" xmlns:pic="http://schemas.openxmlformats.org/drawingml/2006/picture">
+                  <wp:extent cx="1097280" cy="617220"/>
+                  <wp:docPr id="23" name="Picture 23"/>
+                  <wp:cNvGraphicFramePr>
+                    <a:graphicFrameLocks noChangeAspect="1"/>
+                  </wp:cNvGraphicFramePr>
+                  <a:graphic>
+                    <a:graphicData uri="http://schemas.openxmlformats.org/drawingml/2006/picture">
+                      <pic:pic>
+                        <pic:nvPicPr>
+                          <pic:cNvPr id="0" name="frame_0062.jpg"/>
+                          <pic:cNvPicPr/>
+                        </pic:nvPicPr>
+                        <pic:blipFill>
+                          <a:blip r:embed="rId10"/>
+                          <a:stretch>
+                            <a:fillRect/>
+                          </a:stretch>
+                        </pic:blipFill>
+                        <pic:spPr>
+                          <a:xfrm>
+                            <a:off x="0" y="0"/>
+                            <a:ext cx="1097280" cy="617220"/>
+                          </a:xfrm>
+                          <a:prstGeom prst="rect"/>
+                        </pic:spPr>
+                      </pic:pic>
+                    </a:graphicData>
+                  </a:graphic>
+                </wp:inline>
+              </w:drawing>
             </w:r>
           </w:p>
         </w:tc>
@@ -565,7 +1278,38 @@
           </w:tcPr>
           <w:p>
             <w:r>
-              <w:t>frame_0124.jpg</w:t>
+              <w:drawing>
+                <wp:inline xmlns:a="http://schemas.openxmlformats.org/drawingml/2006/main" xmlns:pic="http://schemas.openxmlformats.org/drawingml/2006/picture">
+                  <wp:extent cx="1097280" cy="617220"/>
+                  <wp:docPr id="24" name="Picture 24"/>
+                  <wp:cNvGraphicFramePr>
+                    <a:graphicFrameLocks noChangeAspect="1"/>
+                  </wp:cNvGraphicFramePr>
+                  <a:graphic>
+                    <a:graphicData uri="http://schemas.openxmlformats.org/drawingml/2006/picture">
+                      <pic:pic>
+                        <pic:nvPicPr>
+                          <pic:cNvPr id="0" name="frame_0124.jpg"/>
+                          <pic:cNvPicPr/>
+                        </pic:nvPicPr>
+                        <pic:blipFill>
+                          <a:blip r:embed="rId11"/>
+                          <a:stretch>
+                            <a:fillRect/>
+                          </a:stretch>
+                        </pic:blipFill>
+                        <pic:spPr>
+                          <a:xfrm>
+                            <a:off x="0" y="0"/>
+                            <a:ext cx="1097280" cy="617220"/>
+                          </a:xfrm>
+                          <a:prstGeom prst="rect"/>
+                        </pic:spPr>
+                      </pic:pic>
+                    </a:graphicData>
+                  </a:graphic>
+                </wp:inline>
+              </w:drawing>
             </w:r>
           </w:p>
         </w:tc>
@@ -619,7 +1363,38 @@
           </w:tcPr>
           <w:p>
             <w:r>
-              <w:t>frame_0000.jpg</w:t>
+              <w:drawing>
+                <wp:inline xmlns:a="http://schemas.openxmlformats.org/drawingml/2006/main" xmlns:pic="http://schemas.openxmlformats.org/drawingml/2006/picture">
+                  <wp:extent cx="1097280" cy="617220"/>
+                  <wp:docPr id="25" name="Picture 25"/>
+                  <wp:cNvGraphicFramePr>
+                    <a:graphicFrameLocks noChangeAspect="1"/>
+                  </wp:cNvGraphicFramePr>
+                  <a:graphic>
+                    <a:graphicData uri="http://schemas.openxmlformats.org/drawingml/2006/picture">
+                      <pic:pic>
+                        <pic:nvPicPr>
+                          <pic:cNvPr id="0" name="frame_0000.jpg"/>
+                          <pic:cNvPicPr/>
+                        </pic:nvPicPr>
+                        <pic:blipFill>
+                          <a:blip r:embed="rId9"/>
+                          <a:stretch>
+                            <a:fillRect/>
+                          </a:stretch>
+                        </pic:blipFill>
+                        <pic:spPr>
+                          <a:xfrm>
+                            <a:off x="0" y="0"/>
+                            <a:ext cx="1097280" cy="617220"/>
+                          </a:xfrm>
+                          <a:prstGeom prst="rect"/>
+                        </pic:spPr>
+                      </pic:pic>
+                    </a:graphicData>
+                  </a:graphic>
+                </wp:inline>
+              </w:drawing>
             </w:r>
           </w:p>
         </w:tc>
@@ -629,7 +1404,38 @@
           </w:tcPr>
           <w:p>
             <w:r>
-              <w:t>frame_0062.jpg</w:t>
+              <w:drawing>
+                <wp:inline xmlns:a="http://schemas.openxmlformats.org/drawingml/2006/main" xmlns:pic="http://schemas.openxmlformats.org/drawingml/2006/picture">
+                  <wp:extent cx="1097280" cy="617220"/>
+                  <wp:docPr id="26" name="Picture 26"/>
+                  <wp:cNvGraphicFramePr>
+                    <a:graphicFrameLocks noChangeAspect="1"/>
+                  </wp:cNvGraphicFramePr>
+                  <a:graphic>
+                    <a:graphicData uri="http://schemas.openxmlformats.org/drawingml/2006/picture">
+                      <pic:pic>
+                        <pic:nvPicPr>
+                          <pic:cNvPr id="0" name="frame_0062.jpg"/>
+                          <pic:cNvPicPr/>
+                        </pic:nvPicPr>
+                        <pic:blipFill>
+                          <a:blip r:embed="rId10"/>
+                          <a:stretch>
+                            <a:fillRect/>
+                          </a:stretch>
+                        </pic:blipFill>
+                        <pic:spPr>
+                          <a:xfrm>
+                            <a:off x="0" y="0"/>
+                            <a:ext cx="1097280" cy="617220"/>
+                          </a:xfrm>
+                          <a:prstGeom prst="rect"/>
+                        </pic:spPr>
+                      </pic:pic>
+                    </a:graphicData>
+                  </a:graphic>
+                </wp:inline>
+              </w:drawing>
             </w:r>
           </w:p>
         </w:tc>
@@ -639,7 +1445,38 @@
           </w:tcPr>
           <w:p>
             <w:r>
-              <w:t>frame_0124.jpg</w:t>
+              <w:drawing>
+                <wp:inline xmlns:a="http://schemas.openxmlformats.org/drawingml/2006/main" xmlns:pic="http://schemas.openxmlformats.org/drawingml/2006/picture">
+                  <wp:extent cx="1097280" cy="617220"/>
+                  <wp:docPr id="27" name="Picture 27"/>
+                  <wp:cNvGraphicFramePr>
+                    <a:graphicFrameLocks noChangeAspect="1"/>
+                  </wp:cNvGraphicFramePr>
+                  <a:graphic>
+                    <a:graphicData uri="http://schemas.openxmlformats.org/drawingml/2006/picture">
+                      <pic:pic>
+                        <pic:nvPicPr>
+                          <pic:cNvPr id="0" name="frame_0124.jpg"/>
+                          <pic:cNvPicPr/>
+                        </pic:nvPicPr>
+                        <pic:blipFill>
+                          <a:blip r:embed="rId11"/>
+                          <a:stretch>
+                            <a:fillRect/>
+                          </a:stretch>
+                        </pic:blipFill>
+                        <pic:spPr>
+                          <a:xfrm>
+                            <a:off x="0" y="0"/>
+                            <a:ext cx="1097280" cy="617220"/>
+                          </a:xfrm>
+                          <a:prstGeom prst="rect"/>
+                        </pic:spPr>
+                      </pic:pic>
+                    </a:graphicData>
+                  </a:graphic>
+                </wp:inline>
+              </w:drawing>
             </w:r>
           </w:p>
         </w:tc>
@@ -678,7 +1515,38 @@
           </w:tcPr>
           <w:p>
             <w:r>
-              <w:t>frame_0000.jpg</w:t>
+              <w:drawing>
+                <wp:inline xmlns:a="http://schemas.openxmlformats.org/drawingml/2006/main" xmlns:pic="http://schemas.openxmlformats.org/drawingml/2006/picture">
+                  <wp:extent cx="1097280" cy="617220"/>
+                  <wp:docPr id="28" name="Picture 28"/>
+                  <wp:cNvGraphicFramePr>
+                    <a:graphicFrameLocks noChangeAspect="1"/>
+                  </wp:cNvGraphicFramePr>
+                  <a:graphic>
+                    <a:graphicData uri="http://schemas.openxmlformats.org/drawingml/2006/picture">
+                      <pic:pic>
+                        <pic:nvPicPr>
+                          <pic:cNvPr id="0" name="frame_0000.jpg"/>
+                          <pic:cNvPicPr/>
+                        </pic:nvPicPr>
+                        <pic:blipFill>
+                          <a:blip r:embed="rId9"/>
+                          <a:stretch>
+                            <a:fillRect/>
+                          </a:stretch>
+                        </pic:blipFill>
+                        <pic:spPr>
+                          <a:xfrm>
+                            <a:off x="0" y="0"/>
+                            <a:ext cx="1097280" cy="617220"/>
+                          </a:xfrm>
+                          <a:prstGeom prst="rect"/>
+                        </pic:spPr>
+                      </pic:pic>
+                    </a:graphicData>
+                  </a:graphic>
+                </wp:inline>
+              </w:drawing>
             </w:r>
           </w:p>
         </w:tc>
@@ -688,7 +1556,38 @@
           </w:tcPr>
           <w:p>
             <w:r>
-              <w:t>frame_0062.jpg</w:t>
+              <w:drawing>
+                <wp:inline xmlns:a="http://schemas.openxmlformats.org/drawingml/2006/main" xmlns:pic="http://schemas.openxmlformats.org/drawingml/2006/picture">
+                  <wp:extent cx="1097280" cy="617220"/>
+                  <wp:docPr id="29" name="Picture 29"/>
+                  <wp:cNvGraphicFramePr>
+                    <a:graphicFrameLocks noChangeAspect="1"/>
+                  </wp:cNvGraphicFramePr>
+                  <a:graphic>
+                    <a:graphicData uri="http://schemas.openxmlformats.org/drawingml/2006/picture">
+                      <pic:pic>
+                        <pic:nvPicPr>
+                          <pic:cNvPr id="0" name="frame_0062.jpg"/>
+                          <pic:cNvPicPr/>
+                        </pic:nvPicPr>
+                        <pic:blipFill>
+                          <a:blip r:embed="rId10"/>
+                          <a:stretch>
+                            <a:fillRect/>
+                          </a:stretch>
+                        </pic:blipFill>
+                        <pic:spPr>
+                          <a:xfrm>
+                            <a:off x="0" y="0"/>
+                            <a:ext cx="1097280" cy="617220"/>
+                          </a:xfrm>
+                          <a:prstGeom prst="rect"/>
+                        </pic:spPr>
+                      </pic:pic>
+                    </a:graphicData>
+                  </a:graphic>
+                </wp:inline>
+              </w:drawing>
             </w:r>
           </w:p>
         </w:tc>
@@ -698,7 +1597,38 @@
           </w:tcPr>
           <w:p>
             <w:r>
-              <w:t>frame_0124.jpg</w:t>
+              <w:drawing>
+                <wp:inline xmlns:a="http://schemas.openxmlformats.org/drawingml/2006/main" xmlns:pic="http://schemas.openxmlformats.org/drawingml/2006/picture">
+                  <wp:extent cx="1097280" cy="617220"/>
+                  <wp:docPr id="30" name="Picture 30"/>
+                  <wp:cNvGraphicFramePr>
+                    <a:graphicFrameLocks noChangeAspect="1"/>
+                  </wp:cNvGraphicFramePr>
+                  <a:graphic>
+                    <a:graphicData uri="http://schemas.openxmlformats.org/drawingml/2006/picture">
+                      <pic:pic>
+                        <pic:nvPicPr>
+                          <pic:cNvPr id="0" name="frame_0124.jpg"/>
+                          <pic:cNvPicPr/>
+                        </pic:nvPicPr>
+                        <pic:blipFill>
+                          <a:blip r:embed="rId11"/>
+                          <a:stretch>
+                            <a:fillRect/>
+                          </a:stretch>
+                        </pic:blipFill>
+                        <pic:spPr>
+                          <a:xfrm>
+                            <a:off x="0" y="0"/>
+                            <a:ext cx="1097280" cy="617220"/>
+                          </a:xfrm>
+                          <a:prstGeom prst="rect"/>
+                        </pic:spPr>
+                      </pic:pic>
+                    </a:graphicData>
+                  </a:graphic>
+                </wp:inline>
+              </w:drawing>
             </w:r>
           </w:p>
         </w:tc>
@@ -737,7 +1667,38 @@
           </w:tcPr>
           <w:p>
             <w:r>
-              <w:t>frame_0000.jpg</w:t>
+              <w:drawing>
+                <wp:inline xmlns:a="http://schemas.openxmlformats.org/drawingml/2006/main" xmlns:pic="http://schemas.openxmlformats.org/drawingml/2006/picture">
+                  <wp:extent cx="1097280" cy="617220"/>
+                  <wp:docPr id="31" name="Picture 31"/>
+                  <wp:cNvGraphicFramePr>
+                    <a:graphicFrameLocks noChangeAspect="1"/>
+                  </wp:cNvGraphicFramePr>
+                  <a:graphic>
+                    <a:graphicData uri="http://schemas.openxmlformats.org/drawingml/2006/picture">
+                      <pic:pic>
+                        <pic:nvPicPr>
+                          <pic:cNvPr id="0" name="frame_0000.jpg"/>
+                          <pic:cNvPicPr/>
+                        </pic:nvPicPr>
+                        <pic:blipFill>
+                          <a:blip r:embed="rId9"/>
+                          <a:stretch>
+                            <a:fillRect/>
+                          </a:stretch>
+                        </pic:blipFill>
+                        <pic:spPr>
+                          <a:xfrm>
+                            <a:off x="0" y="0"/>
+                            <a:ext cx="1097280" cy="617220"/>
+                          </a:xfrm>
+                          <a:prstGeom prst="rect"/>
+                        </pic:spPr>
+                      </pic:pic>
+                    </a:graphicData>
+                  </a:graphic>
+                </wp:inline>
+              </w:drawing>
             </w:r>
           </w:p>
         </w:tc>
@@ -747,7 +1708,38 @@
           </w:tcPr>
           <w:p>
             <w:r>
-              <w:t>frame_0062.jpg</w:t>
+              <w:drawing>
+                <wp:inline xmlns:a="http://schemas.openxmlformats.org/drawingml/2006/main" xmlns:pic="http://schemas.openxmlformats.org/drawingml/2006/picture">
+                  <wp:extent cx="1097280" cy="617220"/>
+                  <wp:docPr id="32" name="Picture 32"/>
+                  <wp:cNvGraphicFramePr>
+                    <a:graphicFrameLocks noChangeAspect="1"/>
+                  </wp:cNvGraphicFramePr>
+                  <a:graphic>
+                    <a:graphicData uri="http://schemas.openxmlformats.org/drawingml/2006/picture">
+                      <pic:pic>
+                        <pic:nvPicPr>
+                          <pic:cNvPr id="0" name="frame_0062.jpg"/>
+                          <pic:cNvPicPr/>
+                        </pic:nvPicPr>
+                        <pic:blipFill>
+                          <a:blip r:embed="rId10"/>
+                          <a:stretch>
+                            <a:fillRect/>
+                          </a:stretch>
+                        </pic:blipFill>
+                        <pic:spPr>
+                          <a:xfrm>
+                            <a:off x="0" y="0"/>
+                            <a:ext cx="1097280" cy="617220"/>
+                          </a:xfrm>
+                          <a:prstGeom prst="rect"/>
+                        </pic:spPr>
+                      </pic:pic>
+                    </a:graphicData>
+                  </a:graphic>
+                </wp:inline>
+              </w:drawing>
             </w:r>
           </w:p>
         </w:tc>
@@ -757,7 +1749,38 @@
           </w:tcPr>
           <w:p>
             <w:r>
-              <w:t>frame_0124.jpg</w:t>
+              <w:drawing>
+                <wp:inline xmlns:a="http://schemas.openxmlformats.org/drawingml/2006/main" xmlns:pic="http://schemas.openxmlformats.org/drawingml/2006/picture">
+                  <wp:extent cx="1097280" cy="617220"/>
+                  <wp:docPr id="33" name="Picture 33"/>
+                  <wp:cNvGraphicFramePr>
+                    <a:graphicFrameLocks noChangeAspect="1"/>
+                  </wp:cNvGraphicFramePr>
+                  <a:graphic>
+                    <a:graphicData uri="http://schemas.openxmlformats.org/drawingml/2006/picture">
+                      <pic:pic>
+                        <pic:nvPicPr>
+                          <pic:cNvPr id="0" name="frame_0124.jpg"/>
+                          <pic:cNvPicPr/>
+                        </pic:nvPicPr>
+                        <pic:blipFill>
+                          <a:blip r:embed="rId11"/>
+                          <a:stretch>
+                            <a:fillRect/>
+                          </a:stretch>
+                        </pic:blipFill>
+                        <pic:spPr>
+                          <a:xfrm>
+                            <a:off x="0" y="0"/>
+                            <a:ext cx="1097280" cy="617220"/>
+                          </a:xfrm>
+                          <a:prstGeom prst="rect"/>
+                        </pic:spPr>
+                      </pic:pic>
+                    </a:graphicData>
+                  </a:graphic>
+                </wp:inline>
+              </w:drawing>
             </w:r>
           </w:p>
         </w:tc>
@@ -796,7 +1819,38 @@
           </w:tcPr>
           <w:p>
             <w:r>
-              <w:t>frame_0000.jpg</w:t>
+              <w:drawing>
+                <wp:inline xmlns:a="http://schemas.openxmlformats.org/drawingml/2006/main" xmlns:pic="http://schemas.openxmlformats.org/drawingml/2006/picture">
+                  <wp:extent cx="1097280" cy="617220"/>
+                  <wp:docPr id="34" name="Picture 34"/>
+                  <wp:cNvGraphicFramePr>
+                    <a:graphicFrameLocks noChangeAspect="1"/>
+                  </wp:cNvGraphicFramePr>
+                  <a:graphic>
+                    <a:graphicData uri="http://schemas.openxmlformats.org/drawingml/2006/picture">
+                      <pic:pic>
+                        <pic:nvPicPr>
+                          <pic:cNvPr id="0" name="frame_0000.jpg"/>
+                          <pic:cNvPicPr/>
+                        </pic:nvPicPr>
+                        <pic:blipFill>
+                          <a:blip r:embed="rId9"/>
+                          <a:stretch>
+                            <a:fillRect/>
+                          </a:stretch>
+                        </pic:blipFill>
+                        <pic:spPr>
+                          <a:xfrm>
+                            <a:off x="0" y="0"/>
+                            <a:ext cx="1097280" cy="617220"/>
+                          </a:xfrm>
+                          <a:prstGeom prst="rect"/>
+                        </pic:spPr>
+                      </pic:pic>
+                    </a:graphicData>
+                  </a:graphic>
+                </wp:inline>
+              </w:drawing>
             </w:r>
           </w:p>
         </w:tc>
@@ -806,7 +1860,38 @@
           </w:tcPr>
           <w:p>
             <w:r>
-              <w:t>frame_0062.jpg</w:t>
+              <w:drawing>
+                <wp:inline xmlns:a="http://schemas.openxmlformats.org/drawingml/2006/main" xmlns:pic="http://schemas.openxmlformats.org/drawingml/2006/picture">
+                  <wp:extent cx="1097280" cy="617220"/>
+                  <wp:docPr id="35" name="Picture 35"/>
+                  <wp:cNvGraphicFramePr>
+                    <a:graphicFrameLocks noChangeAspect="1"/>
+                  </wp:cNvGraphicFramePr>
+                  <a:graphic>
+                    <a:graphicData uri="http://schemas.openxmlformats.org/drawingml/2006/picture">
+                      <pic:pic>
+                        <pic:nvPicPr>
+                          <pic:cNvPr id="0" name="frame_0062.jpg"/>
+                          <pic:cNvPicPr/>
+                        </pic:nvPicPr>
+                        <pic:blipFill>
+                          <a:blip r:embed="rId10"/>
+                          <a:stretch>
+                            <a:fillRect/>
+                          </a:stretch>
+                        </pic:blipFill>
+                        <pic:spPr>
+                          <a:xfrm>
+                            <a:off x="0" y="0"/>
+                            <a:ext cx="1097280" cy="617220"/>
+                          </a:xfrm>
+                          <a:prstGeom prst="rect"/>
+                        </pic:spPr>
+                      </pic:pic>
+                    </a:graphicData>
+                  </a:graphic>
+                </wp:inline>
+              </w:drawing>
             </w:r>
           </w:p>
         </w:tc>
@@ -816,7 +1901,38 @@
           </w:tcPr>
           <w:p>
             <w:r>
-              <w:t>frame_0124.jpg</w:t>
+              <w:drawing>
+                <wp:inline xmlns:a="http://schemas.openxmlformats.org/drawingml/2006/main" xmlns:pic="http://schemas.openxmlformats.org/drawingml/2006/picture">
+                  <wp:extent cx="1097280" cy="617220"/>
+                  <wp:docPr id="36" name="Picture 36"/>
+                  <wp:cNvGraphicFramePr>
+                    <a:graphicFrameLocks noChangeAspect="1"/>
+                  </wp:cNvGraphicFramePr>
+                  <a:graphic>
+                    <a:graphicData uri="http://schemas.openxmlformats.org/drawingml/2006/picture">
+                      <pic:pic>
+                        <pic:nvPicPr>
+                          <pic:cNvPr id="0" name="frame_0124.jpg"/>
+                          <pic:cNvPicPr/>
+                        </pic:nvPicPr>
+                        <pic:blipFill>
+                          <a:blip r:embed="rId11"/>
+                          <a:stretch>
+                            <a:fillRect/>
+                          </a:stretch>
+                        </pic:blipFill>
+                        <pic:spPr>
+                          <a:xfrm>
+                            <a:off x="0" y="0"/>
+                            <a:ext cx="1097280" cy="617220"/>
+                          </a:xfrm>
+                          <a:prstGeom prst="rect"/>
+                        </pic:spPr>
+                      </pic:pic>
+                    </a:graphicData>
+                  </a:graphic>
+                </wp:inline>
+              </w:drawing>
             </w:r>
           </w:p>
         </w:tc>
@@ -860,7 +1976,38 @@
           </w:tcPr>
           <w:p>
             <w:r>
-              <w:t>frame_0000.jpg</w:t>
+              <w:drawing>
+                <wp:inline xmlns:a="http://schemas.openxmlformats.org/drawingml/2006/main" xmlns:pic="http://schemas.openxmlformats.org/drawingml/2006/picture">
+                  <wp:extent cx="1097280" cy="617220"/>
+                  <wp:docPr id="37" name="Picture 37"/>
+                  <wp:cNvGraphicFramePr>
+                    <a:graphicFrameLocks noChangeAspect="1"/>
+                  </wp:cNvGraphicFramePr>
+                  <a:graphic>
+                    <a:graphicData uri="http://schemas.openxmlformats.org/drawingml/2006/picture">
+                      <pic:pic>
+                        <pic:nvPicPr>
+                          <pic:cNvPr id="0" name="frame_0000.jpg"/>
+                          <pic:cNvPicPr/>
+                        </pic:nvPicPr>
+                        <pic:blipFill>
+                          <a:blip r:embed="rId9"/>
+                          <a:stretch>
+                            <a:fillRect/>
+                          </a:stretch>
+                        </pic:blipFill>
+                        <pic:spPr>
+                          <a:xfrm>
+                            <a:off x="0" y="0"/>
+                            <a:ext cx="1097280" cy="617220"/>
+                          </a:xfrm>
+                          <a:prstGeom prst="rect"/>
+                        </pic:spPr>
+                      </pic:pic>
+                    </a:graphicData>
+                  </a:graphic>
+                </wp:inline>
+              </w:drawing>
             </w:r>
           </w:p>
         </w:tc>
@@ -870,7 +2017,38 @@
           </w:tcPr>
           <w:p>
             <w:r>
-              <w:t>frame_0062.jpg</w:t>
+              <w:drawing>
+                <wp:inline xmlns:a="http://schemas.openxmlformats.org/drawingml/2006/main" xmlns:pic="http://schemas.openxmlformats.org/drawingml/2006/picture">
+                  <wp:extent cx="1097280" cy="617220"/>
+                  <wp:docPr id="38" name="Picture 38"/>
+                  <wp:cNvGraphicFramePr>
+                    <a:graphicFrameLocks noChangeAspect="1"/>
+                  </wp:cNvGraphicFramePr>
+                  <a:graphic>
+                    <a:graphicData uri="http://schemas.openxmlformats.org/drawingml/2006/picture">
+                      <pic:pic>
+                        <pic:nvPicPr>
+                          <pic:cNvPr id="0" name="frame_0062.jpg"/>
+                          <pic:cNvPicPr/>
+                        </pic:nvPicPr>
+                        <pic:blipFill>
+                          <a:blip r:embed="rId10"/>
+                          <a:stretch>
+                            <a:fillRect/>
+                          </a:stretch>
+                        </pic:blipFill>
+                        <pic:spPr>
+                          <a:xfrm>
+                            <a:off x="0" y="0"/>
+                            <a:ext cx="1097280" cy="617220"/>
+                          </a:xfrm>
+                          <a:prstGeom prst="rect"/>
+                        </pic:spPr>
+                      </pic:pic>
+                    </a:graphicData>
+                  </a:graphic>
+                </wp:inline>
+              </w:drawing>
             </w:r>
           </w:p>
         </w:tc>
@@ -880,7 +2058,38 @@
           </w:tcPr>
           <w:p>
             <w:r>
-              <w:t>frame_0124.jpg</w:t>
+              <w:drawing>
+                <wp:inline xmlns:a="http://schemas.openxmlformats.org/drawingml/2006/main" xmlns:pic="http://schemas.openxmlformats.org/drawingml/2006/picture">
+                  <wp:extent cx="1097280" cy="617220"/>
+                  <wp:docPr id="39" name="Picture 39"/>
+                  <wp:cNvGraphicFramePr>
+                    <a:graphicFrameLocks noChangeAspect="1"/>
+                  </wp:cNvGraphicFramePr>
+                  <a:graphic>
+                    <a:graphicData uri="http://schemas.openxmlformats.org/drawingml/2006/picture">
+                      <pic:pic>
+                        <pic:nvPicPr>
+                          <pic:cNvPr id="0" name="frame_0124.jpg"/>
+                          <pic:cNvPicPr/>
+                        </pic:nvPicPr>
+                        <pic:blipFill>
+                          <a:blip r:embed="rId11"/>
+                          <a:stretch>
+                            <a:fillRect/>
+                          </a:stretch>
+                        </pic:blipFill>
+                        <pic:spPr>
+                          <a:xfrm>
+                            <a:off x="0" y="0"/>
+                            <a:ext cx="1097280" cy="617220"/>
+                          </a:xfrm>
+                          <a:prstGeom prst="rect"/>
+                        </pic:spPr>
+                      </pic:pic>
+                    </a:graphicData>
+                  </a:graphic>
+                </wp:inline>
+              </w:drawing>
             </w:r>
           </w:p>
         </w:tc>
@@ -919,7 +2128,38 @@
           </w:tcPr>
           <w:p>
             <w:r>
-              <w:t>frame_0000.jpg</w:t>
+              <w:drawing>
+                <wp:inline xmlns:a="http://schemas.openxmlformats.org/drawingml/2006/main" xmlns:pic="http://schemas.openxmlformats.org/drawingml/2006/picture">
+                  <wp:extent cx="1097280" cy="617220"/>
+                  <wp:docPr id="40" name="Picture 40"/>
+                  <wp:cNvGraphicFramePr>
+                    <a:graphicFrameLocks noChangeAspect="1"/>
+                  </wp:cNvGraphicFramePr>
+                  <a:graphic>
+                    <a:graphicData uri="http://schemas.openxmlformats.org/drawingml/2006/picture">
+                      <pic:pic>
+                        <pic:nvPicPr>
+                          <pic:cNvPr id="0" name="frame_0000.jpg"/>
+                          <pic:cNvPicPr/>
+                        </pic:nvPicPr>
+                        <pic:blipFill>
+                          <a:blip r:embed="rId9"/>
+                          <a:stretch>
+                            <a:fillRect/>
+                          </a:stretch>
+                        </pic:blipFill>
+                        <pic:spPr>
+                          <a:xfrm>
+                            <a:off x="0" y="0"/>
+                            <a:ext cx="1097280" cy="617220"/>
+                          </a:xfrm>
+                          <a:prstGeom prst="rect"/>
+                        </pic:spPr>
+                      </pic:pic>
+                    </a:graphicData>
+                  </a:graphic>
+                </wp:inline>
+              </w:drawing>
             </w:r>
           </w:p>
         </w:tc>
@@ -929,7 +2169,38 @@
           </w:tcPr>
           <w:p>
             <w:r>
-              <w:t>frame_0062.jpg</w:t>
+              <w:drawing>
+                <wp:inline xmlns:a="http://schemas.openxmlformats.org/drawingml/2006/main" xmlns:pic="http://schemas.openxmlformats.org/drawingml/2006/picture">
+                  <wp:extent cx="1097280" cy="617220"/>
+                  <wp:docPr id="41" name="Picture 41"/>
+                  <wp:cNvGraphicFramePr>
+                    <a:graphicFrameLocks noChangeAspect="1"/>
+                  </wp:cNvGraphicFramePr>
+                  <a:graphic>
+                    <a:graphicData uri="http://schemas.openxmlformats.org/drawingml/2006/picture">
+                      <pic:pic>
+                        <pic:nvPicPr>
+                          <pic:cNvPr id="0" name="frame_0062.jpg"/>
+                          <pic:cNvPicPr/>
+                        </pic:nvPicPr>
+                        <pic:blipFill>
+                          <a:blip r:embed="rId10"/>
+                          <a:stretch>
+                            <a:fillRect/>
+                          </a:stretch>
+                        </pic:blipFill>
+                        <pic:spPr>
+                          <a:xfrm>
+                            <a:off x="0" y="0"/>
+                            <a:ext cx="1097280" cy="617220"/>
+                          </a:xfrm>
+                          <a:prstGeom prst="rect"/>
+                        </pic:spPr>
+                      </pic:pic>
+                    </a:graphicData>
+                  </a:graphic>
+                </wp:inline>
+              </w:drawing>
             </w:r>
           </w:p>
         </w:tc>
@@ -939,7 +2210,38 @@
           </w:tcPr>
           <w:p>
             <w:r>
-              <w:t>frame_0124.jpg</w:t>
+              <w:drawing>
+                <wp:inline xmlns:a="http://schemas.openxmlformats.org/drawingml/2006/main" xmlns:pic="http://schemas.openxmlformats.org/drawingml/2006/picture">
+                  <wp:extent cx="1097280" cy="617220"/>
+                  <wp:docPr id="42" name="Picture 42"/>
+                  <wp:cNvGraphicFramePr>
+                    <a:graphicFrameLocks noChangeAspect="1"/>
+                  </wp:cNvGraphicFramePr>
+                  <a:graphic>
+                    <a:graphicData uri="http://schemas.openxmlformats.org/drawingml/2006/picture">
+                      <pic:pic>
+                        <pic:nvPicPr>
+                          <pic:cNvPr id="0" name="frame_0124.jpg"/>
+                          <pic:cNvPicPr/>
+                        </pic:nvPicPr>
+                        <pic:blipFill>
+                          <a:blip r:embed="rId11"/>
+                          <a:stretch>
+                            <a:fillRect/>
+                          </a:stretch>
+                        </pic:blipFill>
+                        <pic:spPr>
+                          <a:xfrm>
+                            <a:off x="0" y="0"/>
+                            <a:ext cx="1097280" cy="617220"/>
+                          </a:xfrm>
+                          <a:prstGeom prst="rect"/>
+                        </pic:spPr>
+                      </pic:pic>
+                    </a:graphicData>
+                  </a:graphic>
+                </wp:inline>
+              </w:drawing>
             </w:r>
           </w:p>
         </w:tc>
@@ -978,7 +2280,38 @@
           </w:tcPr>
           <w:p>
             <w:r>
-              <w:t>frame_0000.jpg</w:t>
+              <w:drawing>
+                <wp:inline xmlns:a="http://schemas.openxmlformats.org/drawingml/2006/main" xmlns:pic="http://schemas.openxmlformats.org/drawingml/2006/picture">
+                  <wp:extent cx="1097280" cy="617220"/>
+                  <wp:docPr id="43" name="Picture 43"/>
+                  <wp:cNvGraphicFramePr>
+                    <a:graphicFrameLocks noChangeAspect="1"/>
+                  </wp:cNvGraphicFramePr>
+                  <a:graphic>
+                    <a:graphicData uri="http://schemas.openxmlformats.org/drawingml/2006/picture">
+                      <pic:pic>
+                        <pic:nvPicPr>
+                          <pic:cNvPr id="0" name="frame_0000.jpg"/>
+                          <pic:cNvPicPr/>
+                        </pic:nvPicPr>
+                        <pic:blipFill>
+                          <a:blip r:embed="rId9"/>
+                          <a:stretch>
+                            <a:fillRect/>
+                          </a:stretch>
+                        </pic:blipFill>
+                        <pic:spPr>
+                          <a:xfrm>
+                            <a:off x="0" y="0"/>
+                            <a:ext cx="1097280" cy="617220"/>
+                          </a:xfrm>
+                          <a:prstGeom prst="rect"/>
+                        </pic:spPr>
+                      </pic:pic>
+                    </a:graphicData>
+                  </a:graphic>
+                </wp:inline>
+              </w:drawing>
             </w:r>
           </w:p>
         </w:tc>
@@ -988,7 +2321,38 @@
           </w:tcPr>
           <w:p>
             <w:r>
-              <w:t>frame_0062.jpg</w:t>
+              <w:drawing>
+                <wp:inline xmlns:a="http://schemas.openxmlformats.org/drawingml/2006/main" xmlns:pic="http://schemas.openxmlformats.org/drawingml/2006/picture">
+                  <wp:extent cx="1097280" cy="617220"/>
+                  <wp:docPr id="44" name="Picture 44"/>
+                  <wp:cNvGraphicFramePr>
+                    <a:graphicFrameLocks noChangeAspect="1"/>
+                  </wp:cNvGraphicFramePr>
+                  <a:graphic>
+                    <a:graphicData uri="http://schemas.openxmlformats.org/drawingml/2006/picture">
+                      <pic:pic>
+                        <pic:nvPicPr>
+                          <pic:cNvPr id="0" name="frame_0062.jpg"/>
+                          <pic:cNvPicPr/>
+                        </pic:nvPicPr>
+                        <pic:blipFill>
+                          <a:blip r:embed="rId10"/>
+                          <a:stretch>
+                            <a:fillRect/>
+                          </a:stretch>
+                        </pic:blipFill>
+                        <pic:spPr>
+                          <a:xfrm>
+                            <a:off x="0" y="0"/>
+                            <a:ext cx="1097280" cy="617220"/>
+                          </a:xfrm>
+                          <a:prstGeom prst="rect"/>
+                        </pic:spPr>
+                      </pic:pic>
+                    </a:graphicData>
+                  </a:graphic>
+                </wp:inline>
+              </w:drawing>
             </w:r>
           </w:p>
         </w:tc>
@@ -998,7 +2362,38 @@
           </w:tcPr>
           <w:p>
             <w:r>
-              <w:t>frame_0124.jpg</w:t>
+              <w:drawing>
+                <wp:inline xmlns:a="http://schemas.openxmlformats.org/drawingml/2006/main" xmlns:pic="http://schemas.openxmlformats.org/drawingml/2006/picture">
+                  <wp:extent cx="1097280" cy="617220"/>
+                  <wp:docPr id="45" name="Picture 45"/>
+                  <wp:cNvGraphicFramePr>
+                    <a:graphicFrameLocks noChangeAspect="1"/>
+                  </wp:cNvGraphicFramePr>
+                  <a:graphic>
+                    <a:graphicData uri="http://schemas.openxmlformats.org/drawingml/2006/picture">
+                      <pic:pic>
+                        <pic:nvPicPr>
+                          <pic:cNvPr id="0" name="frame_0124.jpg"/>
+                          <pic:cNvPicPr/>
+                        </pic:nvPicPr>
+                        <pic:blipFill>
+                          <a:blip r:embed="rId11"/>
+                          <a:stretch>
+                            <a:fillRect/>
+                          </a:stretch>
+                        </pic:blipFill>
+                        <pic:spPr>
+                          <a:xfrm>
+                            <a:off x="0" y="0"/>
+                            <a:ext cx="1097280" cy="617220"/>
+                          </a:xfrm>
+                          <a:prstGeom prst="rect"/>
+                        </pic:spPr>
+                      </pic:pic>
+                    </a:graphicData>
+                  </a:graphic>
+                </wp:inline>
+              </w:drawing>
             </w:r>
           </w:p>
         </w:tc>
@@ -1037,7 +2432,38 @@
           </w:tcPr>
           <w:p>
             <w:r>
-              <w:t>frame_0000.jpg</w:t>
+              <w:drawing>
+                <wp:inline xmlns:a="http://schemas.openxmlformats.org/drawingml/2006/main" xmlns:pic="http://schemas.openxmlformats.org/drawingml/2006/picture">
+                  <wp:extent cx="1097280" cy="617220"/>
+                  <wp:docPr id="46" name="Picture 46"/>
+                  <wp:cNvGraphicFramePr>
+                    <a:graphicFrameLocks noChangeAspect="1"/>
+                  </wp:cNvGraphicFramePr>
+                  <a:graphic>
+                    <a:graphicData uri="http://schemas.openxmlformats.org/drawingml/2006/picture">
+                      <pic:pic>
+                        <pic:nvPicPr>
+                          <pic:cNvPr id="0" name="frame_0000.jpg"/>
+                          <pic:cNvPicPr/>
+                        </pic:nvPicPr>
+                        <pic:blipFill>
+                          <a:blip r:embed="rId9"/>
+                          <a:stretch>
+                            <a:fillRect/>
+                          </a:stretch>
+                        </pic:blipFill>
+                        <pic:spPr>
+                          <a:xfrm>
+                            <a:off x="0" y="0"/>
+                            <a:ext cx="1097280" cy="617220"/>
+                          </a:xfrm>
+                          <a:prstGeom prst="rect"/>
+                        </pic:spPr>
+                      </pic:pic>
+                    </a:graphicData>
+                  </a:graphic>
+                </wp:inline>
+              </w:drawing>
             </w:r>
           </w:p>
         </w:tc>
@@ -1047,7 +2473,38 @@
           </w:tcPr>
           <w:p>
             <w:r>
-              <w:t>frame_0062.jpg</w:t>
+              <w:drawing>
+                <wp:inline xmlns:a="http://schemas.openxmlformats.org/drawingml/2006/main" xmlns:pic="http://schemas.openxmlformats.org/drawingml/2006/picture">
+                  <wp:extent cx="1097280" cy="617220"/>
+                  <wp:docPr id="47" name="Picture 47"/>
+                  <wp:cNvGraphicFramePr>
+                    <a:graphicFrameLocks noChangeAspect="1"/>
+                  </wp:cNvGraphicFramePr>
+                  <a:graphic>
+                    <a:graphicData uri="http://schemas.openxmlformats.org/drawingml/2006/picture">
+                      <pic:pic>
+                        <pic:nvPicPr>
+                          <pic:cNvPr id="0" name="frame_0062.jpg"/>
+                          <pic:cNvPicPr/>
+                        </pic:nvPicPr>
+                        <pic:blipFill>
+                          <a:blip r:embed="rId10"/>
+                          <a:stretch>
+                            <a:fillRect/>
+                          </a:stretch>
+                        </pic:blipFill>
+                        <pic:spPr>
+                          <a:xfrm>
+                            <a:off x="0" y="0"/>
+                            <a:ext cx="1097280" cy="617220"/>
+                          </a:xfrm>
+                          <a:prstGeom prst="rect"/>
+                        </pic:spPr>
+                      </pic:pic>
+                    </a:graphicData>
+                  </a:graphic>
+                </wp:inline>
+              </w:drawing>
             </w:r>
           </w:p>
         </w:tc>
@@ -1057,7 +2514,38 @@
           </w:tcPr>
           <w:p>
             <w:r>
-              <w:t>frame_0124.jpg</w:t>
+              <w:drawing>
+                <wp:inline xmlns:a="http://schemas.openxmlformats.org/drawingml/2006/main" xmlns:pic="http://schemas.openxmlformats.org/drawingml/2006/picture">
+                  <wp:extent cx="1097280" cy="617220"/>
+                  <wp:docPr id="48" name="Picture 48"/>
+                  <wp:cNvGraphicFramePr>
+                    <a:graphicFrameLocks noChangeAspect="1"/>
+                  </wp:cNvGraphicFramePr>
+                  <a:graphic>
+                    <a:graphicData uri="http://schemas.openxmlformats.org/drawingml/2006/picture">
+                      <pic:pic>
+                        <pic:nvPicPr>
+                          <pic:cNvPr id="0" name="frame_0124.jpg"/>
+                          <pic:cNvPicPr/>
+                        </pic:nvPicPr>
+                        <pic:blipFill>
+                          <a:blip r:embed="rId11"/>
+                          <a:stretch>
+                            <a:fillRect/>
+                          </a:stretch>
+                        </pic:blipFill>
+                        <pic:spPr>
+                          <a:xfrm>
+                            <a:off x="0" y="0"/>
+                            <a:ext cx="1097280" cy="617220"/>
+                          </a:xfrm>
+                          <a:prstGeom prst="rect"/>
+                        </pic:spPr>
+                      </pic:pic>
+                    </a:graphicData>
+                  </a:graphic>
+                </wp:inline>
+              </w:drawing>
             </w:r>
           </w:p>
         </w:tc>
@@ -1111,7 +2599,38 @@
           </w:tcPr>
           <w:p>
             <w:r>
-              <w:t>frame_0000.jpg</w:t>
+              <w:drawing>
+                <wp:inline xmlns:a="http://schemas.openxmlformats.org/drawingml/2006/main" xmlns:pic="http://schemas.openxmlformats.org/drawingml/2006/picture">
+                  <wp:extent cx="1097280" cy="617220"/>
+                  <wp:docPr id="49" name="Picture 49"/>
+                  <wp:cNvGraphicFramePr>
+                    <a:graphicFrameLocks noChangeAspect="1"/>
+                  </wp:cNvGraphicFramePr>
+                  <a:graphic>
+                    <a:graphicData uri="http://schemas.openxmlformats.org/drawingml/2006/picture">
+                      <pic:pic>
+                        <pic:nvPicPr>
+                          <pic:cNvPr id="0" name="frame_0000.jpg"/>
+                          <pic:cNvPicPr/>
+                        </pic:nvPicPr>
+                        <pic:blipFill>
+                          <a:blip r:embed="rId9"/>
+                          <a:stretch>
+                            <a:fillRect/>
+                          </a:stretch>
+                        </pic:blipFill>
+                        <pic:spPr>
+                          <a:xfrm>
+                            <a:off x="0" y="0"/>
+                            <a:ext cx="1097280" cy="617220"/>
+                          </a:xfrm>
+                          <a:prstGeom prst="rect"/>
+                        </pic:spPr>
+                      </pic:pic>
+                    </a:graphicData>
+                  </a:graphic>
+                </wp:inline>
+              </w:drawing>
             </w:r>
           </w:p>
         </w:tc>
@@ -1121,7 +2640,38 @@
           </w:tcPr>
           <w:p>
             <w:r>
-              <w:t>frame_0062.jpg</w:t>
+              <w:drawing>
+                <wp:inline xmlns:a="http://schemas.openxmlformats.org/drawingml/2006/main" xmlns:pic="http://schemas.openxmlformats.org/drawingml/2006/picture">
+                  <wp:extent cx="1097280" cy="617220"/>
+                  <wp:docPr id="50" name="Picture 50"/>
+                  <wp:cNvGraphicFramePr>
+                    <a:graphicFrameLocks noChangeAspect="1"/>
+                  </wp:cNvGraphicFramePr>
+                  <a:graphic>
+                    <a:graphicData uri="http://schemas.openxmlformats.org/drawingml/2006/picture">
+                      <pic:pic>
+                        <pic:nvPicPr>
+                          <pic:cNvPr id="0" name="frame_0062.jpg"/>
+                          <pic:cNvPicPr/>
+                        </pic:nvPicPr>
+                        <pic:blipFill>
+                          <a:blip r:embed="rId10"/>
+                          <a:stretch>
+                            <a:fillRect/>
+                          </a:stretch>
+                        </pic:blipFill>
+                        <pic:spPr>
+                          <a:xfrm>
+                            <a:off x="0" y="0"/>
+                            <a:ext cx="1097280" cy="617220"/>
+                          </a:xfrm>
+                          <a:prstGeom prst="rect"/>
+                        </pic:spPr>
+                      </pic:pic>
+                    </a:graphicData>
+                  </a:graphic>
+                </wp:inline>
+              </w:drawing>
             </w:r>
           </w:p>
         </w:tc>
@@ -1131,7 +2681,38 @@
           </w:tcPr>
           <w:p>
             <w:r>
-              <w:t>frame_0124.jpg</w:t>
+              <w:drawing>
+                <wp:inline xmlns:a="http://schemas.openxmlformats.org/drawingml/2006/main" xmlns:pic="http://schemas.openxmlformats.org/drawingml/2006/picture">
+                  <wp:extent cx="1097280" cy="617220"/>
+                  <wp:docPr id="51" name="Picture 51"/>
+                  <wp:cNvGraphicFramePr>
+                    <a:graphicFrameLocks noChangeAspect="1"/>
+                  </wp:cNvGraphicFramePr>
+                  <a:graphic>
+                    <a:graphicData uri="http://schemas.openxmlformats.org/drawingml/2006/picture">
+                      <pic:pic>
+                        <pic:nvPicPr>
+                          <pic:cNvPr id="0" name="frame_0124.jpg"/>
+                          <pic:cNvPicPr/>
+                        </pic:nvPicPr>
+                        <pic:blipFill>
+                          <a:blip r:embed="rId11"/>
+                          <a:stretch>
+                            <a:fillRect/>
+                          </a:stretch>
+                        </pic:blipFill>
+                        <pic:spPr>
+                          <a:xfrm>
+                            <a:off x="0" y="0"/>
+                            <a:ext cx="1097280" cy="617220"/>
+                          </a:xfrm>
+                          <a:prstGeom prst="rect"/>
+                        </pic:spPr>
+                      </pic:pic>
+                    </a:graphicData>
+                  </a:graphic>
+                </wp:inline>
+              </w:drawing>
             </w:r>
           </w:p>
         </w:tc>
@@ -1170,7 +2751,38 @@
           </w:tcPr>
           <w:p>
             <w:r>
-              <w:t>frame_0000.jpg</w:t>
+              <w:drawing>
+                <wp:inline xmlns:a="http://schemas.openxmlformats.org/drawingml/2006/main" xmlns:pic="http://schemas.openxmlformats.org/drawingml/2006/picture">
+                  <wp:extent cx="1097280" cy="617220"/>
+                  <wp:docPr id="52" name="Picture 52"/>
+                  <wp:cNvGraphicFramePr>
+                    <a:graphicFrameLocks noChangeAspect="1"/>
+                  </wp:cNvGraphicFramePr>
+                  <a:graphic>
+                    <a:graphicData uri="http://schemas.openxmlformats.org/drawingml/2006/picture">
+                      <pic:pic>
+                        <pic:nvPicPr>
+                          <pic:cNvPr id="0" name="frame_0000.jpg"/>
+                          <pic:cNvPicPr/>
+                        </pic:nvPicPr>
+                        <pic:blipFill>
+                          <a:blip r:embed="rId9"/>
+                          <a:stretch>
+                            <a:fillRect/>
+                          </a:stretch>
+                        </pic:blipFill>
+                        <pic:spPr>
+                          <a:xfrm>
+                            <a:off x="0" y="0"/>
+                            <a:ext cx="1097280" cy="617220"/>
+                          </a:xfrm>
+                          <a:prstGeom prst="rect"/>
+                        </pic:spPr>
+                      </pic:pic>
+                    </a:graphicData>
+                  </a:graphic>
+                </wp:inline>
+              </w:drawing>
             </w:r>
           </w:p>
         </w:tc>
@@ -1180,7 +2792,38 @@
           </w:tcPr>
           <w:p>
             <w:r>
-              <w:t>frame_0062.jpg</w:t>
+              <w:drawing>
+                <wp:inline xmlns:a="http://schemas.openxmlformats.org/drawingml/2006/main" xmlns:pic="http://schemas.openxmlformats.org/drawingml/2006/picture">
+                  <wp:extent cx="1097280" cy="617220"/>
+                  <wp:docPr id="53" name="Picture 53"/>
+                  <wp:cNvGraphicFramePr>
+                    <a:graphicFrameLocks noChangeAspect="1"/>
+                  </wp:cNvGraphicFramePr>
+                  <a:graphic>
+                    <a:graphicData uri="http://schemas.openxmlformats.org/drawingml/2006/picture">
+                      <pic:pic>
+                        <pic:nvPicPr>
+                          <pic:cNvPr id="0" name="frame_0062.jpg"/>
+                          <pic:cNvPicPr/>
+                        </pic:nvPicPr>
+                        <pic:blipFill>
+                          <a:blip r:embed="rId10"/>
+                          <a:stretch>
+                            <a:fillRect/>
+                          </a:stretch>
+                        </pic:blipFill>
+                        <pic:spPr>
+                          <a:xfrm>
+                            <a:off x="0" y="0"/>
+                            <a:ext cx="1097280" cy="617220"/>
+                          </a:xfrm>
+                          <a:prstGeom prst="rect"/>
+                        </pic:spPr>
+                      </pic:pic>
+                    </a:graphicData>
+                  </a:graphic>
+                </wp:inline>
+              </w:drawing>
             </w:r>
           </w:p>
         </w:tc>
@@ -1190,7 +2833,38 @@
           </w:tcPr>
           <w:p>
             <w:r>
-              <w:t>frame_0124.jpg</w:t>
+              <w:drawing>
+                <wp:inline xmlns:a="http://schemas.openxmlformats.org/drawingml/2006/main" xmlns:pic="http://schemas.openxmlformats.org/drawingml/2006/picture">
+                  <wp:extent cx="1097280" cy="617220"/>
+                  <wp:docPr id="54" name="Picture 54"/>
+                  <wp:cNvGraphicFramePr>
+                    <a:graphicFrameLocks noChangeAspect="1"/>
+                  </wp:cNvGraphicFramePr>
+                  <a:graphic>
+                    <a:graphicData uri="http://schemas.openxmlformats.org/drawingml/2006/picture">
+                      <pic:pic>
+                        <pic:nvPicPr>
+                          <pic:cNvPr id="0" name="frame_0124.jpg"/>
+                          <pic:cNvPicPr/>
+                        </pic:nvPicPr>
+                        <pic:blipFill>
+                          <a:blip r:embed="rId11"/>
+                          <a:stretch>
+                            <a:fillRect/>
+                          </a:stretch>
+                        </pic:blipFill>
+                        <pic:spPr>
+                          <a:xfrm>
+                            <a:off x="0" y="0"/>
+                            <a:ext cx="1097280" cy="617220"/>
+                          </a:xfrm>
+                          <a:prstGeom prst="rect"/>
+                        </pic:spPr>
+                      </pic:pic>
+                    </a:graphicData>
+                  </a:graphic>
+                </wp:inline>
+              </w:drawing>
             </w:r>
           </w:p>
         </w:tc>
@@ -1229,7 +2903,38 @@
           </w:tcPr>
           <w:p>
             <w:r>
-              <w:t>frame_0000.jpg</w:t>
+              <w:drawing>
+                <wp:inline xmlns:a="http://schemas.openxmlformats.org/drawingml/2006/main" xmlns:pic="http://schemas.openxmlformats.org/drawingml/2006/picture">
+                  <wp:extent cx="1097280" cy="617220"/>
+                  <wp:docPr id="55" name="Picture 55"/>
+                  <wp:cNvGraphicFramePr>
+                    <a:graphicFrameLocks noChangeAspect="1"/>
+                  </wp:cNvGraphicFramePr>
+                  <a:graphic>
+                    <a:graphicData uri="http://schemas.openxmlformats.org/drawingml/2006/picture">
+                      <pic:pic>
+                        <pic:nvPicPr>
+                          <pic:cNvPr id="0" name="frame_0000.jpg"/>
+                          <pic:cNvPicPr/>
+                        </pic:nvPicPr>
+                        <pic:blipFill>
+                          <a:blip r:embed="rId9"/>
+                          <a:stretch>
+                            <a:fillRect/>
+                          </a:stretch>
+                        </pic:blipFill>
+                        <pic:spPr>
+                          <a:xfrm>
+                            <a:off x="0" y="0"/>
+                            <a:ext cx="1097280" cy="617220"/>
+                          </a:xfrm>
+                          <a:prstGeom prst="rect"/>
+                        </pic:spPr>
+                      </pic:pic>
+                    </a:graphicData>
+                  </a:graphic>
+                </wp:inline>
+              </w:drawing>
             </w:r>
           </w:p>
         </w:tc>
@@ -1239,7 +2944,38 @@
           </w:tcPr>
           <w:p>
             <w:r>
-              <w:t>frame_0062.jpg</w:t>
+              <w:drawing>
+                <wp:inline xmlns:a="http://schemas.openxmlformats.org/drawingml/2006/main" xmlns:pic="http://schemas.openxmlformats.org/drawingml/2006/picture">
+                  <wp:extent cx="1097280" cy="617220"/>
+                  <wp:docPr id="56" name="Picture 56"/>
+                  <wp:cNvGraphicFramePr>
+                    <a:graphicFrameLocks noChangeAspect="1"/>
+                  </wp:cNvGraphicFramePr>
+                  <a:graphic>
+                    <a:graphicData uri="http://schemas.openxmlformats.org/drawingml/2006/picture">
+                      <pic:pic>
+                        <pic:nvPicPr>
+                          <pic:cNvPr id="0" name="frame_0062.jpg"/>
+                          <pic:cNvPicPr/>
+                        </pic:nvPicPr>
+                        <pic:blipFill>
+                          <a:blip r:embed="rId10"/>
+                          <a:stretch>
+                            <a:fillRect/>
+                          </a:stretch>
+                        </pic:blipFill>
+                        <pic:spPr>
+                          <a:xfrm>
+                            <a:off x="0" y="0"/>
+                            <a:ext cx="1097280" cy="617220"/>
+                          </a:xfrm>
+                          <a:prstGeom prst="rect"/>
+                        </pic:spPr>
+                      </pic:pic>
+                    </a:graphicData>
+                  </a:graphic>
+                </wp:inline>
+              </w:drawing>
             </w:r>
           </w:p>
         </w:tc>
@@ -1249,7 +2985,38 @@
           </w:tcPr>
           <w:p>
             <w:r>
-              <w:t>frame_0124.jpg</w:t>
+              <w:drawing>
+                <wp:inline xmlns:a="http://schemas.openxmlformats.org/drawingml/2006/main" xmlns:pic="http://schemas.openxmlformats.org/drawingml/2006/picture">
+                  <wp:extent cx="1097280" cy="617220"/>
+                  <wp:docPr id="57" name="Picture 57"/>
+                  <wp:cNvGraphicFramePr>
+                    <a:graphicFrameLocks noChangeAspect="1"/>
+                  </wp:cNvGraphicFramePr>
+                  <a:graphic>
+                    <a:graphicData uri="http://schemas.openxmlformats.org/drawingml/2006/picture">
+                      <pic:pic>
+                        <pic:nvPicPr>
+                          <pic:cNvPr id="0" name="frame_0124.jpg"/>
+                          <pic:cNvPicPr/>
+                        </pic:nvPicPr>
+                        <pic:blipFill>
+                          <a:blip r:embed="rId11"/>
+                          <a:stretch>
+                            <a:fillRect/>
+                          </a:stretch>
+                        </pic:blipFill>
+                        <pic:spPr>
+                          <a:xfrm>
+                            <a:off x="0" y="0"/>
+                            <a:ext cx="1097280" cy="617220"/>
+                          </a:xfrm>
+                          <a:prstGeom prst="rect"/>
+                        </pic:spPr>
+                      </pic:pic>
+                    </a:graphicData>
+                  </a:graphic>
+                </wp:inline>
+              </w:drawing>
             </w:r>
           </w:p>
         </w:tc>
@@ -1288,7 +3055,38 @@
           </w:tcPr>
           <w:p>
             <w:r>
-              <w:t>frame_0000.jpg</w:t>
+              <w:drawing>
+                <wp:inline xmlns:a="http://schemas.openxmlformats.org/drawingml/2006/main" xmlns:pic="http://schemas.openxmlformats.org/drawingml/2006/picture">
+                  <wp:extent cx="1097280" cy="617220"/>
+                  <wp:docPr id="58" name="Picture 58"/>
+                  <wp:cNvGraphicFramePr>
+                    <a:graphicFrameLocks noChangeAspect="1"/>
+                  </wp:cNvGraphicFramePr>
+                  <a:graphic>
+                    <a:graphicData uri="http://schemas.openxmlformats.org/drawingml/2006/picture">
+                      <pic:pic>
+                        <pic:nvPicPr>
+                          <pic:cNvPr id="0" name="frame_0000.jpg"/>
+                          <pic:cNvPicPr/>
+                        </pic:nvPicPr>
+                        <pic:blipFill>
+                          <a:blip r:embed="rId9"/>
+                          <a:stretch>
+                            <a:fillRect/>
+                          </a:stretch>
+                        </pic:blipFill>
+                        <pic:spPr>
+                          <a:xfrm>
+                            <a:off x="0" y="0"/>
+                            <a:ext cx="1097280" cy="617220"/>
+                          </a:xfrm>
+                          <a:prstGeom prst="rect"/>
+                        </pic:spPr>
+                      </pic:pic>
+                    </a:graphicData>
+                  </a:graphic>
+                </wp:inline>
+              </w:drawing>
             </w:r>
           </w:p>
         </w:tc>
@@ -1298,7 +3096,38 @@
           </w:tcPr>
           <w:p>
             <w:r>
-              <w:t>frame_0062.jpg</w:t>
+              <w:drawing>
+                <wp:inline xmlns:a="http://schemas.openxmlformats.org/drawingml/2006/main" xmlns:pic="http://schemas.openxmlformats.org/drawingml/2006/picture">
+                  <wp:extent cx="1097280" cy="617220"/>
+                  <wp:docPr id="59" name="Picture 59"/>
+                  <wp:cNvGraphicFramePr>
+                    <a:graphicFrameLocks noChangeAspect="1"/>
+                  </wp:cNvGraphicFramePr>
+                  <a:graphic>
+                    <a:graphicData uri="http://schemas.openxmlformats.org/drawingml/2006/picture">
+                      <pic:pic>
+                        <pic:nvPicPr>
+                          <pic:cNvPr id="0" name="frame_0062.jpg"/>
+                          <pic:cNvPicPr/>
+                        </pic:nvPicPr>
+                        <pic:blipFill>
+                          <a:blip r:embed="rId10"/>
+                          <a:stretch>
+                            <a:fillRect/>
+                          </a:stretch>
+                        </pic:blipFill>
+                        <pic:spPr>
+                          <a:xfrm>
+                            <a:off x="0" y="0"/>
+                            <a:ext cx="1097280" cy="617220"/>
+                          </a:xfrm>
+                          <a:prstGeom prst="rect"/>
+                        </pic:spPr>
+                      </pic:pic>
+                    </a:graphicData>
+                  </a:graphic>
+                </wp:inline>
+              </w:drawing>
             </w:r>
           </w:p>
         </w:tc>
@@ -1308,7 +3137,38 @@
           </w:tcPr>
           <w:p>
             <w:r>
-              <w:t>frame_0124.jpg</w:t>
+              <w:drawing>
+                <wp:inline xmlns:a="http://schemas.openxmlformats.org/drawingml/2006/main" xmlns:pic="http://schemas.openxmlformats.org/drawingml/2006/picture">
+                  <wp:extent cx="1097280" cy="617220"/>
+                  <wp:docPr id="60" name="Picture 60"/>
+                  <wp:cNvGraphicFramePr>
+                    <a:graphicFrameLocks noChangeAspect="1"/>
+                  </wp:cNvGraphicFramePr>
+                  <a:graphic>
+                    <a:graphicData uri="http://schemas.openxmlformats.org/drawingml/2006/picture">
+                      <pic:pic>
+                        <pic:nvPicPr>
+                          <pic:cNvPr id="0" name="frame_0124.jpg"/>
+                          <pic:cNvPicPr/>
+                        </pic:nvPicPr>
+                        <pic:blipFill>
+                          <a:blip r:embed="rId11"/>
+                          <a:stretch>
+                            <a:fillRect/>
+                          </a:stretch>
+                        </pic:blipFill>
+                        <pic:spPr>
+                          <a:xfrm>
+                            <a:off x="0" y="0"/>
+                            <a:ext cx="1097280" cy="617220"/>
+                          </a:xfrm>
+                          <a:prstGeom prst="rect"/>
+                        </pic:spPr>
+                      </pic:pic>
+                    </a:graphicData>
+                  </a:graphic>
+                </wp:inline>
+              </w:drawing>
             </w:r>
           </w:p>
         </w:tc>
@@ -1352,7 +3212,38 @@
           </w:tcPr>
           <w:p>
             <w:r>
-              <w:t>frame_0000.jpg</w:t>
+              <w:drawing>
+                <wp:inline xmlns:a="http://schemas.openxmlformats.org/drawingml/2006/main" xmlns:pic="http://schemas.openxmlformats.org/drawingml/2006/picture">
+                  <wp:extent cx="1097280" cy="617220"/>
+                  <wp:docPr id="61" name="Picture 61"/>
+                  <wp:cNvGraphicFramePr>
+                    <a:graphicFrameLocks noChangeAspect="1"/>
+                  </wp:cNvGraphicFramePr>
+                  <a:graphic>
+                    <a:graphicData uri="http://schemas.openxmlformats.org/drawingml/2006/picture">
+                      <pic:pic>
+                        <pic:nvPicPr>
+                          <pic:cNvPr id="0" name="frame_0000.jpg"/>
+                          <pic:cNvPicPr/>
+                        </pic:nvPicPr>
+                        <pic:blipFill>
+                          <a:blip r:embed="rId9"/>
+                          <a:stretch>
+                            <a:fillRect/>
+                          </a:stretch>
+                        </pic:blipFill>
+                        <pic:spPr>
+                          <a:xfrm>
+                            <a:off x="0" y="0"/>
+                            <a:ext cx="1097280" cy="617220"/>
+                          </a:xfrm>
+                          <a:prstGeom prst="rect"/>
+                        </pic:spPr>
+                      </pic:pic>
+                    </a:graphicData>
+                  </a:graphic>
+                </wp:inline>
+              </w:drawing>
             </w:r>
           </w:p>
         </w:tc>
@@ -1362,7 +3253,38 @@
           </w:tcPr>
           <w:p>
             <w:r>
-              <w:t>frame_0062.jpg</w:t>
+              <w:drawing>
+                <wp:inline xmlns:a="http://schemas.openxmlformats.org/drawingml/2006/main" xmlns:pic="http://schemas.openxmlformats.org/drawingml/2006/picture">
+                  <wp:extent cx="1097280" cy="617220"/>
+                  <wp:docPr id="62" name="Picture 62"/>
+                  <wp:cNvGraphicFramePr>
+                    <a:graphicFrameLocks noChangeAspect="1"/>
+                  </wp:cNvGraphicFramePr>
+                  <a:graphic>
+                    <a:graphicData uri="http://schemas.openxmlformats.org/drawingml/2006/picture">
+                      <pic:pic>
+                        <pic:nvPicPr>
+                          <pic:cNvPr id="0" name="frame_0062.jpg"/>
+                          <pic:cNvPicPr/>
+                        </pic:nvPicPr>
+                        <pic:blipFill>
+                          <a:blip r:embed="rId10"/>
+                          <a:stretch>
+                            <a:fillRect/>
+                          </a:stretch>
+                        </pic:blipFill>
+                        <pic:spPr>
+                          <a:xfrm>
+                            <a:off x="0" y="0"/>
+                            <a:ext cx="1097280" cy="617220"/>
+                          </a:xfrm>
+                          <a:prstGeom prst="rect"/>
+                        </pic:spPr>
+                      </pic:pic>
+                    </a:graphicData>
+                  </a:graphic>
+                </wp:inline>
+              </w:drawing>
             </w:r>
           </w:p>
         </w:tc>
@@ -1372,7 +3294,38 @@
           </w:tcPr>
           <w:p>
             <w:r>
-              <w:t>frame_0124.jpg</w:t>
+              <w:drawing>
+                <wp:inline xmlns:a="http://schemas.openxmlformats.org/drawingml/2006/main" xmlns:pic="http://schemas.openxmlformats.org/drawingml/2006/picture">
+                  <wp:extent cx="1097280" cy="617220"/>
+                  <wp:docPr id="63" name="Picture 63"/>
+                  <wp:cNvGraphicFramePr>
+                    <a:graphicFrameLocks noChangeAspect="1"/>
+                  </wp:cNvGraphicFramePr>
+                  <a:graphic>
+                    <a:graphicData uri="http://schemas.openxmlformats.org/drawingml/2006/picture">
+                      <pic:pic>
+                        <pic:nvPicPr>
+                          <pic:cNvPr id="0" name="frame_0124.jpg"/>
+                          <pic:cNvPicPr/>
+                        </pic:nvPicPr>
+                        <pic:blipFill>
+                          <a:blip r:embed="rId11"/>
+                          <a:stretch>
+                            <a:fillRect/>
+                          </a:stretch>
+                        </pic:blipFill>
+                        <pic:spPr>
+                          <a:xfrm>
+                            <a:off x="0" y="0"/>
+                            <a:ext cx="1097280" cy="617220"/>
+                          </a:xfrm>
+                          <a:prstGeom prst="rect"/>
+                        </pic:spPr>
+                      </pic:pic>
+                    </a:graphicData>
+                  </a:graphic>
+                </wp:inline>
+              </w:drawing>
             </w:r>
           </w:p>
         </w:tc>
@@ -1411,7 +3364,38 @@
           </w:tcPr>
           <w:p>
             <w:r>
-              <w:t>frame_0000.jpg</w:t>
+              <w:drawing>
+                <wp:inline xmlns:a="http://schemas.openxmlformats.org/drawingml/2006/main" xmlns:pic="http://schemas.openxmlformats.org/drawingml/2006/picture">
+                  <wp:extent cx="1097280" cy="617220"/>
+                  <wp:docPr id="64" name="Picture 64"/>
+                  <wp:cNvGraphicFramePr>
+                    <a:graphicFrameLocks noChangeAspect="1"/>
+                  </wp:cNvGraphicFramePr>
+                  <a:graphic>
+                    <a:graphicData uri="http://schemas.openxmlformats.org/drawingml/2006/picture">
+                      <pic:pic>
+                        <pic:nvPicPr>
+                          <pic:cNvPr id="0" name="frame_0000.jpg"/>
+                          <pic:cNvPicPr/>
+                        </pic:nvPicPr>
+                        <pic:blipFill>
+                          <a:blip r:embed="rId9"/>
+                          <a:stretch>
+                            <a:fillRect/>
+                          </a:stretch>
+                        </pic:blipFill>
+                        <pic:spPr>
+                          <a:xfrm>
+                            <a:off x="0" y="0"/>
+                            <a:ext cx="1097280" cy="617220"/>
+                          </a:xfrm>
+                          <a:prstGeom prst="rect"/>
+                        </pic:spPr>
+                      </pic:pic>
+                    </a:graphicData>
+                  </a:graphic>
+                </wp:inline>
+              </w:drawing>
             </w:r>
           </w:p>
         </w:tc>
@@ -1421,7 +3405,38 @@
           </w:tcPr>
           <w:p>
             <w:r>
-              <w:t>frame_0062.jpg</w:t>
+              <w:drawing>
+                <wp:inline xmlns:a="http://schemas.openxmlformats.org/drawingml/2006/main" xmlns:pic="http://schemas.openxmlformats.org/drawingml/2006/picture">
+                  <wp:extent cx="1097280" cy="617220"/>
+                  <wp:docPr id="65" name="Picture 65"/>
+                  <wp:cNvGraphicFramePr>
+                    <a:graphicFrameLocks noChangeAspect="1"/>
+                  </wp:cNvGraphicFramePr>
+                  <a:graphic>
+                    <a:graphicData uri="http://schemas.openxmlformats.org/drawingml/2006/picture">
+                      <pic:pic>
+                        <pic:nvPicPr>
+                          <pic:cNvPr id="0" name="frame_0062.jpg"/>
+                          <pic:cNvPicPr/>
+                        </pic:nvPicPr>
+                        <pic:blipFill>
+                          <a:blip r:embed="rId10"/>
+                          <a:stretch>
+                            <a:fillRect/>
+                          </a:stretch>
+                        </pic:blipFill>
+                        <pic:spPr>
+                          <a:xfrm>
+                            <a:off x="0" y="0"/>
+                            <a:ext cx="1097280" cy="617220"/>
+                          </a:xfrm>
+                          <a:prstGeom prst="rect"/>
+                        </pic:spPr>
+                      </pic:pic>
+                    </a:graphicData>
+                  </a:graphic>
+                </wp:inline>
+              </w:drawing>
             </w:r>
           </w:p>
         </w:tc>
@@ -1431,7 +3446,38 @@
           </w:tcPr>
           <w:p>
             <w:r>
-              <w:t>frame_0124.jpg</w:t>
+              <w:drawing>
+                <wp:inline xmlns:a="http://schemas.openxmlformats.org/drawingml/2006/main" xmlns:pic="http://schemas.openxmlformats.org/drawingml/2006/picture">
+                  <wp:extent cx="1097280" cy="617220"/>
+                  <wp:docPr id="66" name="Picture 66"/>
+                  <wp:cNvGraphicFramePr>
+                    <a:graphicFrameLocks noChangeAspect="1"/>
+                  </wp:cNvGraphicFramePr>
+                  <a:graphic>
+                    <a:graphicData uri="http://schemas.openxmlformats.org/drawingml/2006/picture">
+                      <pic:pic>
+                        <pic:nvPicPr>
+                          <pic:cNvPr id="0" name="frame_0124.jpg"/>
+                          <pic:cNvPicPr/>
+                        </pic:nvPicPr>
+                        <pic:blipFill>
+                          <a:blip r:embed="rId11"/>
+                          <a:stretch>
+                            <a:fillRect/>
+                          </a:stretch>
+                        </pic:blipFill>
+                        <pic:spPr>
+                          <a:xfrm>
+                            <a:off x="0" y="0"/>
+                            <a:ext cx="1097280" cy="617220"/>
+                          </a:xfrm>
+                          <a:prstGeom prst="rect"/>
+                        </pic:spPr>
+                      </pic:pic>
+                    </a:graphicData>
+                  </a:graphic>
+                </wp:inline>
+              </w:drawing>
             </w:r>
           </w:p>
         </w:tc>
@@ -1470,7 +3516,38 @@
           </w:tcPr>
           <w:p>
             <w:r>
-              <w:t>frame_0000.jpg</w:t>
+              <w:drawing>
+                <wp:inline xmlns:a="http://schemas.openxmlformats.org/drawingml/2006/main" xmlns:pic="http://schemas.openxmlformats.org/drawingml/2006/picture">
+                  <wp:extent cx="1097280" cy="617220"/>
+                  <wp:docPr id="67" name="Picture 67"/>
+                  <wp:cNvGraphicFramePr>
+                    <a:graphicFrameLocks noChangeAspect="1"/>
+                  </wp:cNvGraphicFramePr>
+                  <a:graphic>
+                    <a:graphicData uri="http://schemas.openxmlformats.org/drawingml/2006/picture">
+                      <pic:pic>
+                        <pic:nvPicPr>
+                          <pic:cNvPr id="0" name="frame_0000.jpg"/>
+                          <pic:cNvPicPr/>
+                        </pic:nvPicPr>
+                        <pic:blipFill>
+                          <a:blip r:embed="rId9"/>
+                          <a:stretch>
+                            <a:fillRect/>
+                          </a:stretch>
+                        </pic:blipFill>
+                        <pic:spPr>
+                          <a:xfrm>
+                            <a:off x="0" y="0"/>
+                            <a:ext cx="1097280" cy="617220"/>
+                          </a:xfrm>
+                          <a:prstGeom prst="rect"/>
+                        </pic:spPr>
+                      </pic:pic>
+                    </a:graphicData>
+                  </a:graphic>
+                </wp:inline>
+              </w:drawing>
             </w:r>
           </w:p>
         </w:tc>
@@ -1480,7 +3557,38 @@
           </w:tcPr>
           <w:p>
             <w:r>
-              <w:t>frame_0062.jpg</w:t>
+              <w:drawing>
+                <wp:inline xmlns:a="http://schemas.openxmlformats.org/drawingml/2006/main" xmlns:pic="http://schemas.openxmlformats.org/drawingml/2006/picture">
+                  <wp:extent cx="1097280" cy="617220"/>
+                  <wp:docPr id="68" name="Picture 68"/>
+                  <wp:cNvGraphicFramePr>
+                    <a:graphicFrameLocks noChangeAspect="1"/>
+                  </wp:cNvGraphicFramePr>
+                  <a:graphic>
+                    <a:graphicData uri="http://schemas.openxmlformats.org/drawingml/2006/picture">
+                      <pic:pic>
+                        <pic:nvPicPr>
+                          <pic:cNvPr id="0" name="frame_0062.jpg"/>
+                          <pic:cNvPicPr/>
+                        </pic:nvPicPr>
+                        <pic:blipFill>
+                          <a:blip r:embed="rId10"/>
+                          <a:stretch>
+                            <a:fillRect/>
+                          </a:stretch>
+                        </pic:blipFill>
+                        <pic:spPr>
+                          <a:xfrm>
+                            <a:off x="0" y="0"/>
+                            <a:ext cx="1097280" cy="617220"/>
+                          </a:xfrm>
+                          <a:prstGeom prst="rect"/>
+                        </pic:spPr>
+                      </pic:pic>
+                    </a:graphicData>
+                  </a:graphic>
+                </wp:inline>
+              </w:drawing>
             </w:r>
           </w:p>
         </w:tc>
@@ -1490,7 +3598,38 @@
           </w:tcPr>
           <w:p>
             <w:r>
-              <w:t>frame_0124.jpg</w:t>
+              <w:drawing>
+                <wp:inline xmlns:a="http://schemas.openxmlformats.org/drawingml/2006/main" xmlns:pic="http://schemas.openxmlformats.org/drawingml/2006/picture">
+                  <wp:extent cx="1097280" cy="617220"/>
+                  <wp:docPr id="69" name="Picture 69"/>
+                  <wp:cNvGraphicFramePr>
+                    <a:graphicFrameLocks noChangeAspect="1"/>
+                  </wp:cNvGraphicFramePr>
+                  <a:graphic>
+                    <a:graphicData uri="http://schemas.openxmlformats.org/drawingml/2006/picture">
+                      <pic:pic>
+                        <pic:nvPicPr>
+                          <pic:cNvPr id="0" name="frame_0124.jpg"/>
+                          <pic:cNvPicPr/>
+                        </pic:nvPicPr>
+                        <pic:blipFill>
+                          <a:blip r:embed="rId11"/>
+                          <a:stretch>
+                            <a:fillRect/>
+                          </a:stretch>
+                        </pic:blipFill>
+                        <pic:spPr>
+                          <a:xfrm>
+                            <a:off x="0" y="0"/>
+                            <a:ext cx="1097280" cy="617220"/>
+                          </a:xfrm>
+                          <a:prstGeom prst="rect"/>
+                        </pic:spPr>
+                      </pic:pic>
+                    </a:graphicData>
+                  </a:graphic>
+                </wp:inline>
+              </w:drawing>
             </w:r>
           </w:p>
         </w:tc>
@@ -1529,7 +3668,38 @@
           </w:tcPr>
           <w:p>
             <w:r>
-              <w:t>frame_0000.jpg</w:t>
+              <w:drawing>
+                <wp:inline xmlns:a="http://schemas.openxmlformats.org/drawingml/2006/main" xmlns:pic="http://schemas.openxmlformats.org/drawingml/2006/picture">
+                  <wp:extent cx="1097280" cy="617220"/>
+                  <wp:docPr id="70" name="Picture 70"/>
+                  <wp:cNvGraphicFramePr>
+                    <a:graphicFrameLocks noChangeAspect="1"/>
+                  </wp:cNvGraphicFramePr>
+                  <a:graphic>
+                    <a:graphicData uri="http://schemas.openxmlformats.org/drawingml/2006/picture">
+                      <pic:pic>
+                        <pic:nvPicPr>
+                          <pic:cNvPr id="0" name="frame_0000.jpg"/>
+                          <pic:cNvPicPr/>
+                        </pic:nvPicPr>
+                        <pic:blipFill>
+                          <a:blip r:embed="rId9"/>
+                          <a:stretch>
+                            <a:fillRect/>
+                          </a:stretch>
+                        </pic:blipFill>
+                        <pic:spPr>
+                          <a:xfrm>
+                            <a:off x="0" y="0"/>
+                            <a:ext cx="1097280" cy="617220"/>
+                          </a:xfrm>
+                          <a:prstGeom prst="rect"/>
+                        </pic:spPr>
+                      </pic:pic>
+                    </a:graphicData>
+                  </a:graphic>
+                </wp:inline>
+              </w:drawing>
             </w:r>
           </w:p>
         </w:tc>
@@ -1539,7 +3709,38 @@
           </w:tcPr>
           <w:p>
             <w:r>
-              <w:t>frame_0062.jpg</w:t>
+              <w:drawing>
+                <wp:inline xmlns:a="http://schemas.openxmlformats.org/drawingml/2006/main" xmlns:pic="http://schemas.openxmlformats.org/drawingml/2006/picture">
+                  <wp:extent cx="1097280" cy="617220"/>
+                  <wp:docPr id="71" name="Picture 71"/>
+                  <wp:cNvGraphicFramePr>
+                    <a:graphicFrameLocks noChangeAspect="1"/>
+                  </wp:cNvGraphicFramePr>
+                  <a:graphic>
+                    <a:graphicData uri="http://schemas.openxmlformats.org/drawingml/2006/picture">
+                      <pic:pic>
+                        <pic:nvPicPr>
+                          <pic:cNvPr id="0" name="frame_0062.jpg"/>
+                          <pic:cNvPicPr/>
+                        </pic:nvPicPr>
+                        <pic:blipFill>
+                          <a:blip r:embed="rId10"/>
+                          <a:stretch>
+                            <a:fillRect/>
+                          </a:stretch>
+                        </pic:blipFill>
+                        <pic:spPr>
+                          <a:xfrm>
+                            <a:off x="0" y="0"/>
+                            <a:ext cx="1097280" cy="617220"/>
+                          </a:xfrm>
+                          <a:prstGeom prst="rect"/>
+                        </pic:spPr>
+                      </pic:pic>
+                    </a:graphicData>
+                  </a:graphic>
+                </wp:inline>
+              </w:drawing>
             </w:r>
           </w:p>
         </w:tc>
@@ -1549,7 +3750,38 @@
           </w:tcPr>
           <w:p>
             <w:r>
-              <w:t>frame_0124.jpg</w:t>
+              <w:drawing>
+                <wp:inline xmlns:a="http://schemas.openxmlformats.org/drawingml/2006/main" xmlns:pic="http://schemas.openxmlformats.org/drawingml/2006/picture">
+                  <wp:extent cx="1097280" cy="617220"/>
+                  <wp:docPr id="72" name="Picture 72"/>
+                  <wp:cNvGraphicFramePr>
+                    <a:graphicFrameLocks noChangeAspect="1"/>
+                  </wp:cNvGraphicFramePr>
+                  <a:graphic>
+                    <a:graphicData uri="http://schemas.openxmlformats.org/drawingml/2006/picture">
+                      <pic:pic>
+                        <pic:nvPicPr>
+                          <pic:cNvPr id="0" name="frame_0124.jpg"/>
+                          <pic:cNvPicPr/>
+                        </pic:nvPicPr>
+                        <pic:blipFill>
+                          <a:blip r:embed="rId11"/>
+                          <a:stretch>
+                            <a:fillRect/>
+                          </a:stretch>
+                        </pic:blipFill>
+                        <pic:spPr>
+                          <a:xfrm>
+                            <a:off x="0" y="0"/>
+                            <a:ext cx="1097280" cy="617220"/>
+                          </a:xfrm>
+                          <a:prstGeom prst="rect"/>
+                        </pic:spPr>
+                      </pic:pic>
+                    </a:graphicData>
+                  </a:graphic>
+                </wp:inline>
+              </w:drawing>
             </w:r>
           </w:p>
         </w:tc>
@@ -1596,7 +3828,38 @@
           </w:tcPr>
           <w:p>
             <w:r>
-              <w:t>frame_0000.jpg</w:t>
+              <w:drawing>
+                <wp:inline xmlns:a="http://schemas.openxmlformats.org/drawingml/2006/main" xmlns:pic="http://schemas.openxmlformats.org/drawingml/2006/picture">
+                  <wp:extent cx="1280160" cy="720090"/>
+                  <wp:docPr id="73" name="Picture 73"/>
+                  <wp:cNvGraphicFramePr>
+                    <a:graphicFrameLocks noChangeAspect="1"/>
+                  </wp:cNvGraphicFramePr>
+                  <a:graphic>
+                    <a:graphicData uri="http://schemas.openxmlformats.org/drawingml/2006/picture">
+                      <pic:pic>
+                        <pic:nvPicPr>
+                          <pic:cNvPr id="0" name="frame_0000.jpg"/>
+                          <pic:cNvPicPr/>
+                        </pic:nvPicPr>
+                        <pic:blipFill>
+                          <a:blip r:embed="rId9"/>
+                          <a:stretch>
+                            <a:fillRect/>
+                          </a:stretch>
+                        </pic:blipFill>
+                        <pic:spPr>
+                          <a:xfrm>
+                            <a:off x="0" y="0"/>
+                            <a:ext cx="1280160" cy="720090"/>
+                          </a:xfrm>
+                          <a:prstGeom prst="rect"/>
+                        </pic:spPr>
+                      </pic:pic>
+                    </a:graphicData>
+                  </a:graphic>
+                </wp:inline>
+              </w:drawing>
             </w:r>
           </w:p>
         </w:tc>
@@ -1606,7 +3869,38 @@
           </w:tcPr>
           <w:p>
             <w:r>
-              <w:t>frame_0062.jpg</w:t>
+              <w:drawing>
+                <wp:inline xmlns:a="http://schemas.openxmlformats.org/drawingml/2006/main" xmlns:pic="http://schemas.openxmlformats.org/drawingml/2006/picture">
+                  <wp:extent cx="1280160" cy="720090"/>
+                  <wp:docPr id="74" name="Picture 74"/>
+                  <wp:cNvGraphicFramePr>
+                    <a:graphicFrameLocks noChangeAspect="1"/>
+                  </wp:cNvGraphicFramePr>
+                  <a:graphic>
+                    <a:graphicData uri="http://schemas.openxmlformats.org/drawingml/2006/picture">
+                      <pic:pic>
+                        <pic:nvPicPr>
+                          <pic:cNvPr id="0" name="frame_0062.jpg"/>
+                          <pic:cNvPicPr/>
+                        </pic:nvPicPr>
+                        <pic:blipFill>
+                          <a:blip r:embed="rId10"/>
+                          <a:stretch>
+                            <a:fillRect/>
+                          </a:stretch>
+                        </pic:blipFill>
+                        <pic:spPr>
+                          <a:xfrm>
+                            <a:off x="0" y="0"/>
+                            <a:ext cx="1280160" cy="720090"/>
+                          </a:xfrm>
+                          <a:prstGeom prst="rect"/>
+                        </pic:spPr>
+                      </pic:pic>
+                    </a:graphicData>
+                  </a:graphic>
+                </wp:inline>
+              </w:drawing>
             </w:r>
           </w:p>
         </w:tc>
@@ -1616,7 +3910,38 @@
           </w:tcPr>
           <w:p>
             <w:r>
-              <w:t>frame_0124.jpg</w:t>
+              <w:drawing>
+                <wp:inline xmlns:a="http://schemas.openxmlformats.org/drawingml/2006/main" xmlns:pic="http://schemas.openxmlformats.org/drawingml/2006/picture">
+                  <wp:extent cx="1280160" cy="720090"/>
+                  <wp:docPr id="75" name="Picture 75"/>
+                  <wp:cNvGraphicFramePr>
+                    <a:graphicFrameLocks noChangeAspect="1"/>
+                  </wp:cNvGraphicFramePr>
+                  <a:graphic>
+                    <a:graphicData uri="http://schemas.openxmlformats.org/drawingml/2006/picture">
+                      <pic:pic>
+                        <pic:nvPicPr>
+                          <pic:cNvPr id="0" name="frame_0124.jpg"/>
+                          <pic:cNvPicPr/>
+                        </pic:nvPicPr>
+                        <pic:blipFill>
+                          <a:blip r:embed="rId11"/>
+                          <a:stretch>
+                            <a:fillRect/>
+                          </a:stretch>
+                        </pic:blipFill>
+                        <pic:spPr>
+                          <a:xfrm>
+                            <a:off x="0" y="0"/>
+                            <a:ext cx="1280160" cy="720090"/>
+                          </a:xfrm>
+                          <a:prstGeom prst="rect"/>
+                        </pic:spPr>
+                      </pic:pic>
+                    </a:graphicData>
+                  </a:graphic>
+                </wp:inline>
+              </w:drawing>
             </w:r>
           </w:p>
         </w:tc>
@@ -1668,7 +3993,38 @@
           </w:tcPr>
           <w:p>
             <w:r>
-              <w:t>frame_0000.jpg</w:t>
+              <w:drawing>
+                <wp:inline xmlns:a="http://schemas.openxmlformats.org/drawingml/2006/main" xmlns:pic="http://schemas.openxmlformats.org/drawingml/2006/picture">
+                  <wp:extent cx="1280160" cy="720090"/>
+                  <wp:docPr id="76" name="Picture 76"/>
+                  <wp:cNvGraphicFramePr>
+                    <a:graphicFrameLocks noChangeAspect="1"/>
+                  </wp:cNvGraphicFramePr>
+                  <a:graphic>
+                    <a:graphicData uri="http://schemas.openxmlformats.org/drawingml/2006/picture">
+                      <pic:pic>
+                        <pic:nvPicPr>
+                          <pic:cNvPr id="0" name="frame_0000.jpg"/>
+                          <pic:cNvPicPr/>
+                        </pic:nvPicPr>
+                        <pic:blipFill>
+                          <a:blip r:embed="rId9"/>
+                          <a:stretch>
+                            <a:fillRect/>
+                          </a:stretch>
+                        </pic:blipFill>
+                        <pic:spPr>
+                          <a:xfrm>
+                            <a:off x="0" y="0"/>
+                            <a:ext cx="1280160" cy="720090"/>
+                          </a:xfrm>
+                          <a:prstGeom prst="rect"/>
+                        </pic:spPr>
+                      </pic:pic>
+                    </a:graphicData>
+                  </a:graphic>
+                </wp:inline>
+              </w:drawing>
             </w:r>
           </w:p>
         </w:tc>
@@ -1678,7 +4034,38 @@
           </w:tcPr>
           <w:p>
             <w:r>
-              <w:t>frame_0062.jpg</w:t>
+              <w:drawing>
+                <wp:inline xmlns:a="http://schemas.openxmlformats.org/drawingml/2006/main" xmlns:pic="http://schemas.openxmlformats.org/drawingml/2006/picture">
+                  <wp:extent cx="1280160" cy="720090"/>
+                  <wp:docPr id="77" name="Picture 77"/>
+                  <wp:cNvGraphicFramePr>
+                    <a:graphicFrameLocks noChangeAspect="1"/>
+                  </wp:cNvGraphicFramePr>
+                  <a:graphic>
+                    <a:graphicData uri="http://schemas.openxmlformats.org/drawingml/2006/picture">
+                      <pic:pic>
+                        <pic:nvPicPr>
+                          <pic:cNvPr id="0" name="frame_0062.jpg"/>
+                          <pic:cNvPicPr/>
+                        </pic:nvPicPr>
+                        <pic:blipFill>
+                          <a:blip r:embed="rId10"/>
+                          <a:stretch>
+                            <a:fillRect/>
+                          </a:stretch>
+                        </pic:blipFill>
+                        <pic:spPr>
+                          <a:xfrm>
+                            <a:off x="0" y="0"/>
+                            <a:ext cx="1280160" cy="720090"/>
+                          </a:xfrm>
+                          <a:prstGeom prst="rect"/>
+                        </pic:spPr>
+                      </pic:pic>
+                    </a:graphicData>
+                  </a:graphic>
+                </wp:inline>
+              </w:drawing>
             </w:r>
           </w:p>
         </w:tc>
@@ -1688,7 +4075,38 @@
           </w:tcPr>
           <w:p>
             <w:r>
-              <w:t>frame_0124.jpg</w:t>
+              <w:drawing>
+                <wp:inline xmlns:a="http://schemas.openxmlformats.org/drawingml/2006/main" xmlns:pic="http://schemas.openxmlformats.org/drawingml/2006/picture">
+                  <wp:extent cx="1280160" cy="720090"/>
+                  <wp:docPr id="78" name="Picture 78"/>
+                  <wp:cNvGraphicFramePr>
+                    <a:graphicFrameLocks noChangeAspect="1"/>
+                  </wp:cNvGraphicFramePr>
+                  <a:graphic>
+                    <a:graphicData uri="http://schemas.openxmlformats.org/drawingml/2006/picture">
+                      <pic:pic>
+                        <pic:nvPicPr>
+                          <pic:cNvPr id="0" name="frame_0124.jpg"/>
+                          <pic:cNvPicPr/>
+                        </pic:nvPicPr>
+                        <pic:blipFill>
+                          <a:blip r:embed="rId11"/>
+                          <a:stretch>
+                            <a:fillRect/>
+                          </a:stretch>
+                        </pic:blipFill>
+                        <pic:spPr>
+                          <a:xfrm>
+                            <a:off x="0" y="0"/>
+                            <a:ext cx="1280160" cy="720090"/>
+                          </a:xfrm>
+                          <a:prstGeom prst="rect"/>
+                        </pic:spPr>
+                      </pic:pic>
+                    </a:graphicData>
+                  </a:graphic>
+                </wp:inline>
+              </w:drawing>
             </w:r>
           </w:p>
         </w:tc>
@@ -1755,7 +4173,38 @@
           </w:tcPr>
           <w:p>
             <w:r>
-              <w:t>frame_0000.jpg</w:t>
+              <w:drawing>
+                <wp:inline xmlns:a="http://schemas.openxmlformats.org/drawingml/2006/main" xmlns:pic="http://schemas.openxmlformats.org/drawingml/2006/picture">
+                  <wp:extent cx="1280160" cy="720090"/>
+                  <wp:docPr id="79" name="Picture 79"/>
+                  <wp:cNvGraphicFramePr>
+                    <a:graphicFrameLocks noChangeAspect="1"/>
+                  </wp:cNvGraphicFramePr>
+                  <a:graphic>
+                    <a:graphicData uri="http://schemas.openxmlformats.org/drawingml/2006/picture">
+                      <pic:pic>
+                        <pic:nvPicPr>
+                          <pic:cNvPr id="0" name="frame_0000.jpg"/>
+                          <pic:cNvPicPr/>
+                        </pic:nvPicPr>
+                        <pic:blipFill>
+                          <a:blip r:embed="rId9"/>
+                          <a:stretch>
+                            <a:fillRect/>
+                          </a:stretch>
+                        </pic:blipFill>
+                        <pic:spPr>
+                          <a:xfrm>
+                            <a:off x="0" y="0"/>
+                            <a:ext cx="1280160" cy="720090"/>
+                          </a:xfrm>
+                          <a:prstGeom prst="rect"/>
+                        </pic:spPr>
+                      </pic:pic>
+                    </a:graphicData>
+                  </a:graphic>
+                </wp:inline>
+              </w:drawing>
             </w:r>
           </w:p>
         </w:tc>
@@ -1765,7 +4214,38 @@
           </w:tcPr>
           <w:p>
             <w:r>
-              <w:t>frame_0062.jpg</w:t>
+              <w:drawing>
+                <wp:inline xmlns:a="http://schemas.openxmlformats.org/drawingml/2006/main" xmlns:pic="http://schemas.openxmlformats.org/drawingml/2006/picture">
+                  <wp:extent cx="1280160" cy="720090"/>
+                  <wp:docPr id="80" name="Picture 80"/>
+                  <wp:cNvGraphicFramePr>
+                    <a:graphicFrameLocks noChangeAspect="1"/>
+                  </wp:cNvGraphicFramePr>
+                  <a:graphic>
+                    <a:graphicData uri="http://schemas.openxmlformats.org/drawingml/2006/picture">
+                      <pic:pic>
+                        <pic:nvPicPr>
+                          <pic:cNvPr id="0" name="frame_0062.jpg"/>
+                          <pic:cNvPicPr/>
+                        </pic:nvPicPr>
+                        <pic:blipFill>
+                          <a:blip r:embed="rId10"/>
+                          <a:stretch>
+                            <a:fillRect/>
+                          </a:stretch>
+                        </pic:blipFill>
+                        <pic:spPr>
+                          <a:xfrm>
+                            <a:off x="0" y="0"/>
+                            <a:ext cx="1280160" cy="720090"/>
+                          </a:xfrm>
+                          <a:prstGeom prst="rect"/>
+                        </pic:spPr>
+                      </pic:pic>
+                    </a:graphicData>
+                  </a:graphic>
+                </wp:inline>
+              </w:drawing>
             </w:r>
           </w:p>
         </w:tc>
@@ -1775,7 +4255,38 @@
           </w:tcPr>
           <w:p>
             <w:r>
-              <w:t>frame_0124.jpg</w:t>
+              <w:drawing>
+                <wp:inline xmlns:a="http://schemas.openxmlformats.org/drawingml/2006/main" xmlns:pic="http://schemas.openxmlformats.org/drawingml/2006/picture">
+                  <wp:extent cx="1280160" cy="720090"/>
+                  <wp:docPr id="81" name="Picture 81"/>
+                  <wp:cNvGraphicFramePr>
+                    <a:graphicFrameLocks noChangeAspect="1"/>
+                  </wp:cNvGraphicFramePr>
+                  <a:graphic>
+                    <a:graphicData uri="http://schemas.openxmlformats.org/drawingml/2006/picture">
+                      <pic:pic>
+                        <pic:nvPicPr>
+                          <pic:cNvPr id="0" name="frame_0124.jpg"/>
+                          <pic:cNvPicPr/>
+                        </pic:nvPicPr>
+                        <pic:blipFill>
+                          <a:blip r:embed="rId11"/>
+                          <a:stretch>
+                            <a:fillRect/>
+                          </a:stretch>
+                        </pic:blipFill>
+                        <pic:spPr>
+                          <a:xfrm>
+                            <a:off x="0" y="0"/>
+                            <a:ext cx="1280160" cy="720090"/>
+                          </a:xfrm>
+                          <a:prstGeom prst="rect"/>
+                        </pic:spPr>
+                      </pic:pic>
+                    </a:graphicData>
+                  </a:graphic>
+                </wp:inline>
+              </w:drawing>
             </w:r>
           </w:p>
         </w:tc>
@@ -1817,7 +4328,38 @@
           </w:tcPr>
           <w:p>
             <w:r>
-              <w:t>frame_0000.jpg</w:t>
+              <w:drawing>
+                <wp:inline xmlns:a="http://schemas.openxmlformats.org/drawingml/2006/main" xmlns:pic="http://schemas.openxmlformats.org/drawingml/2006/picture">
+                  <wp:extent cx="1280160" cy="720090"/>
+                  <wp:docPr id="82" name="Picture 82"/>
+                  <wp:cNvGraphicFramePr>
+                    <a:graphicFrameLocks noChangeAspect="1"/>
+                  </wp:cNvGraphicFramePr>
+                  <a:graphic>
+                    <a:graphicData uri="http://schemas.openxmlformats.org/drawingml/2006/picture">
+                      <pic:pic>
+                        <pic:nvPicPr>
+                          <pic:cNvPr id="0" name="frame_0000.jpg"/>
+                          <pic:cNvPicPr/>
+                        </pic:nvPicPr>
+                        <pic:blipFill>
+                          <a:blip r:embed="rId9"/>
+                          <a:stretch>
+                            <a:fillRect/>
+                          </a:stretch>
+                        </pic:blipFill>
+                        <pic:spPr>
+                          <a:xfrm>
+                            <a:off x="0" y="0"/>
+                            <a:ext cx="1280160" cy="720090"/>
+                          </a:xfrm>
+                          <a:prstGeom prst="rect"/>
+                        </pic:spPr>
+                      </pic:pic>
+                    </a:graphicData>
+                  </a:graphic>
+                </wp:inline>
+              </w:drawing>
             </w:r>
           </w:p>
         </w:tc>
@@ -1827,7 +4369,38 @@
           </w:tcPr>
           <w:p>
             <w:r>
-              <w:t>frame_0062.jpg</w:t>
+              <w:drawing>
+                <wp:inline xmlns:a="http://schemas.openxmlformats.org/drawingml/2006/main" xmlns:pic="http://schemas.openxmlformats.org/drawingml/2006/picture">
+                  <wp:extent cx="1280160" cy="720090"/>
+                  <wp:docPr id="83" name="Picture 83"/>
+                  <wp:cNvGraphicFramePr>
+                    <a:graphicFrameLocks noChangeAspect="1"/>
+                  </wp:cNvGraphicFramePr>
+                  <a:graphic>
+                    <a:graphicData uri="http://schemas.openxmlformats.org/drawingml/2006/picture">
+                      <pic:pic>
+                        <pic:nvPicPr>
+                          <pic:cNvPr id="0" name="frame_0062.jpg"/>
+                          <pic:cNvPicPr/>
+                        </pic:nvPicPr>
+                        <pic:blipFill>
+                          <a:blip r:embed="rId10"/>
+                          <a:stretch>
+                            <a:fillRect/>
+                          </a:stretch>
+                        </pic:blipFill>
+                        <pic:spPr>
+                          <a:xfrm>
+                            <a:off x="0" y="0"/>
+                            <a:ext cx="1280160" cy="720090"/>
+                          </a:xfrm>
+                          <a:prstGeom prst="rect"/>
+                        </pic:spPr>
+                      </pic:pic>
+                    </a:graphicData>
+                  </a:graphic>
+                </wp:inline>
+              </w:drawing>
             </w:r>
           </w:p>
         </w:tc>
@@ -1837,7 +4410,38 @@
           </w:tcPr>
           <w:p>
             <w:r>
-              <w:t>frame_0124.jpg</w:t>
+              <w:drawing>
+                <wp:inline xmlns:a="http://schemas.openxmlformats.org/drawingml/2006/main" xmlns:pic="http://schemas.openxmlformats.org/drawingml/2006/picture">
+                  <wp:extent cx="1280160" cy="720090"/>
+                  <wp:docPr id="84" name="Picture 84"/>
+                  <wp:cNvGraphicFramePr>
+                    <a:graphicFrameLocks noChangeAspect="1"/>
+                  </wp:cNvGraphicFramePr>
+                  <a:graphic>
+                    <a:graphicData uri="http://schemas.openxmlformats.org/drawingml/2006/picture">
+                      <pic:pic>
+                        <pic:nvPicPr>
+                          <pic:cNvPr id="0" name="frame_0124.jpg"/>
+                          <pic:cNvPicPr/>
+                        </pic:nvPicPr>
+                        <pic:blipFill>
+                          <a:blip r:embed="rId11"/>
+                          <a:stretch>
+                            <a:fillRect/>
+                          </a:stretch>
+                        </pic:blipFill>
+                        <pic:spPr>
+                          <a:xfrm>
+                            <a:off x="0" y="0"/>
+                            <a:ext cx="1280160" cy="720090"/>
+                          </a:xfrm>
+                          <a:prstGeom prst="rect"/>
+                        </pic:spPr>
+                      </pic:pic>
+                    </a:graphicData>
+                  </a:graphic>
+                </wp:inline>
+              </w:drawing>
             </w:r>
           </w:p>
         </w:tc>

</xml_diff>